<commit_message>
Update 2.1.4.1 Hỗ trợ, tiếp nhận phản ánh và kiến nghị
</commit_message>
<xml_diff>
--- a/He_thong_thong_tin_giai_quyet_hanh_chinh/TRAN NGUYEN MINH QUAN_25410288/TRAN NGUYEN MINH QUAN_25410288.docx
+++ b/He_thong_thong_tin_giai_quyet_hanh_chinh/TRAN NGUYEN MINH QUAN_25410288/TRAN NGUYEN MINH QUAN_25410288.docx
@@ -79,7 +79,7 @@
           <w:szCs w:val="26"/>
         </w:rPr>
         <w:drawing>
-          <wp:inline distT="0" distB="0" distL="0" distR="0" wp14:anchorId="61AA30EF" wp14:editId="5DA8AB9C">
+          <wp:inline distT="0" distB="0" distL="0" distR="0" wp14:anchorId="61AA30EF" wp14:editId="5163E60D">
             <wp:extent cx="1948539" cy="1606164"/>
             <wp:effectExtent l="0" t="0" r="0" b="0"/>
             <wp:docPr id="990850389" name="Picture 1"/>
@@ -2398,6 +2398,33 @@
         <w:rPr>
           <w:rFonts w:cs="Times New Roman"/>
           <w:szCs w:val="26"/>
+          <w:lang w:val="vi-VN"/>
+        </w:rPr>
+      </w:pPr>
+    </w:p>
+    <w:p>
+      <w:pPr>
+        <w:rPr>
+          <w:rFonts w:cs="Times New Roman"/>
+          <w:szCs w:val="26"/>
+          <w:lang w:val="vi-VN"/>
+        </w:rPr>
+      </w:pPr>
+    </w:p>
+    <w:p>
+      <w:pPr>
+        <w:rPr>
+          <w:rFonts w:cs="Times New Roman"/>
+          <w:szCs w:val="26"/>
+          <w:lang w:val="vi-VN"/>
+        </w:rPr>
+      </w:pPr>
+    </w:p>
+    <w:p>
+      <w:pPr>
+        <w:rPr>
+          <w:rFonts w:cs="Times New Roman"/>
+          <w:szCs w:val="26"/>
         </w:rPr>
       </w:pPr>
       <w:r>
@@ -4644,6 +4671,7 @@
         <w:rPr>
           <w:b/>
           <w:bCs/>
+          <w:noProof/>
           <w:sz w:val="28"/>
           <w:szCs w:val="24"/>
           <w:lang w:val="vi-VN"/>
@@ -5144,6 +5172,7 @@
         <w:rPr>
           <w:b/>
           <w:bCs/>
+          <w:noProof/>
           <w:sz w:val="28"/>
           <w:szCs w:val="24"/>
           <w:lang w:val="vi-VN"/>
@@ -5668,6 +5697,7 @@
         <w:rPr>
           <w:b/>
           <w:bCs/>
+          <w:noProof/>
           <w:sz w:val="28"/>
           <w:szCs w:val="24"/>
           <w:lang w:val="vi-VN"/>
@@ -6170,6 +6200,7 @@
         <w:rPr>
           <w:b/>
           <w:bCs/>
+          <w:noProof/>
           <w:sz w:val="28"/>
           <w:szCs w:val="24"/>
           <w:lang w:val="vi-VN"/>
@@ -6707,6 +6738,7 @@
       </w:pPr>
       <w:r>
         <w:rPr>
+          <w:noProof/>
           <w:lang w:val="vi-VN"/>
         </w:rPr>
         <w:drawing>
@@ -11417,6 +11449,7 @@
   <w:style w:type="character" w:default="1" w:styleId="DefaultParagraphFont">
     <w:name w:val="Default Paragraph Font"/>
     <w:uiPriority w:val="1"/>
+    <w:semiHidden/>
     <w:unhideWhenUsed/>
   </w:style>
   <w:style w:type="table" w:default="1" w:styleId="TableNormal">

</xml_diff>

<commit_message>
Update ảnh các quy trình phần hỗ trợ
</commit_message>
<xml_diff>
--- a/He_thong_thong_tin_giai_quyet_hanh_chinh/TRAN NGUYEN MINH QUAN_25410288/TRAN NGUYEN MINH QUAN_25410288.docx
+++ b/He_thong_thong_tin_giai_quyet_hanh_chinh/TRAN NGUYEN MINH QUAN_25410288/TRAN NGUYEN MINH QUAN_25410288.docx
@@ -8483,6 +8483,14 @@
       <w:r>
         <w:t>Cổng thanh toán điện tử, ngân hàng hoặc tổ chức cung ứng dịch vụ thanh toán và cơ quan giải quyết thủ tục hành chính.</w:t>
       </w:r>
+    </w:p>
+    <w:p>
+      <w:pPr>
+        <w:spacing w:line="240" w:lineRule="auto"/>
+        <w:rPr>
+          <w:lang w:val="vi-VN"/>
+        </w:rPr>
+      </w:pPr>
     </w:p>
     <w:p>
       <w:r>

</xml_diff>

<commit_message>
Update mô hình BPMN Phản ánh kiến nghị
</commit_message>
<xml_diff>
--- a/He_thong_thong_tin_giai_quyet_hanh_chinh/TRAN NGUYEN MINH QUAN_25410288/TRAN NGUYEN MINH QUAN_25410288.docx
+++ b/He_thong_thong_tin_giai_quyet_hanh_chinh/TRAN NGUYEN MINH QUAN_25410288/TRAN NGUYEN MINH QUAN_25410288.docx
@@ -1,6 +1,6 @@
 
 <file path=word/document.xml><?xml version="1.0" encoding="utf-8"?>
-<w:document xmlns:wpc="http://schemas.microsoft.com/office/word/2010/wordprocessingCanvas" xmlns:cx="http://schemas.microsoft.com/office/drawing/2014/chartex" xmlns:cx1="http://schemas.microsoft.com/office/drawing/2015/9/8/chartex" xmlns:cx2="http://schemas.microsoft.com/office/drawing/2015/10/21/chartex" xmlns:cx3="http://schemas.microsoft.com/office/drawing/2016/5/9/chartex" xmlns:cx4="http://schemas.microsoft.com/office/drawing/2016/5/10/chartex" xmlns:cx5="http://schemas.microsoft.com/office/drawing/2016/5/11/chartex" xmlns:cx6="http://schemas.microsoft.com/office/drawing/2016/5/12/chartex" xmlns:cx7="http://schemas.microsoft.com/office/drawing/2016/5/13/chartex" xmlns:cx8="http://schemas.microsoft.com/office/drawing/2016/5/14/chartex" xmlns:mc="http://schemas.openxmlformats.org/markup-compatibility/2006" xmlns:aink="http://schemas.microsoft.com/office/drawing/2016/ink" xmlns:am3d="http://schemas.microsoft.com/office/drawing/2017/model3d" xmlns:o="urn:schemas-microsoft-com:office:office" xmlns:oel="http://schemas.microsoft.com/office/2019/extlst" xmlns:r="http://schemas.openxmlformats.org/officeDocument/2006/relationships" xmlns:m="http://schemas.openxmlformats.org/officeDocument/2006/math" xmlns:v="urn:schemas-microsoft-com:vml" xmlns:wp14="http://schemas.microsoft.com/office/word/2010/wordprocessingDrawing" xmlns:wp="http://schemas.openxmlformats.org/drawingml/2006/wordprocessingDrawing" xmlns:w10="urn:schemas-microsoft-com:office:word" xmlns:w="http://schemas.openxmlformats.org/wordprocessingml/2006/main" xmlns:w14="http://schemas.microsoft.com/office/word/2010/wordml" xmlns:w15="http://schemas.microsoft.com/office/word/2012/wordml" xmlns:w16cei="http://schemas.microsoft.com/office/word/2026/wordml/cei" xmlns:w16cex="http://schemas.microsoft.com/office/word/2018/wordml/cex" xmlns:w16cid="http://schemas.microsoft.com/office/word/2016/wordml/cid" xmlns:w16="http://schemas.microsoft.com/office/word/2018/wordml" xmlns:w16du="http://schemas.microsoft.com/office/word/2023/wordml/word16du" xmlns:w16sdtdh="http://schemas.microsoft.com/office/word/2020/wordml/sdtdatahash" xmlns:w16sdtfl="http://schemas.microsoft.com/office/word/2024/wordml/sdtformatlock" xmlns:w16se="http://schemas.microsoft.com/office/word/2015/wordml/symex" xmlns:wpg="http://schemas.microsoft.com/office/word/2010/wordprocessingGroup" xmlns:wpi="http://schemas.microsoft.com/office/word/2010/wordprocessingInk" xmlns:wne="http://schemas.microsoft.com/office/word/2006/wordml" xmlns:wps="http://schemas.microsoft.com/office/word/2010/wordprocessingShape" mc:Ignorable="w14 w15 w16se w16cid w16 w16cex w16sdtdh w16sdtfl w16du wp14">
+<w:document xmlns:wpc="http://schemas.microsoft.com/office/word/2010/wordprocessingCanvas" xmlns:cx="http://schemas.microsoft.com/office/drawing/2014/chartex" xmlns:cx1="http://schemas.microsoft.com/office/drawing/2015/9/8/chartex" xmlns:cx2="http://schemas.microsoft.com/office/drawing/2015/10/21/chartex" xmlns:cx3="http://schemas.microsoft.com/office/drawing/2016/5/9/chartex" xmlns:cx4="http://schemas.microsoft.com/office/drawing/2016/5/10/chartex" xmlns:cx5="http://schemas.microsoft.com/office/drawing/2016/5/11/chartex" xmlns:cx6="http://schemas.microsoft.com/office/drawing/2016/5/12/chartex" xmlns:cx7="http://schemas.microsoft.com/office/drawing/2016/5/13/chartex" xmlns:cx8="http://schemas.microsoft.com/office/drawing/2016/5/14/chartex" xmlns:mc="http://schemas.openxmlformats.org/markup-compatibility/2006" xmlns:aink="http://schemas.microsoft.com/office/drawing/2016/ink" xmlns:am3d="http://schemas.microsoft.com/office/drawing/2017/model3d" xmlns:o="urn:schemas-microsoft-com:office:office" xmlns:oel="http://schemas.microsoft.com/office/2019/extlst" xmlns:r="http://schemas.openxmlformats.org/officeDocument/2006/relationships" xmlns:m="http://schemas.openxmlformats.org/officeDocument/2006/math" xmlns:v="urn:schemas-microsoft-com:vml" xmlns:wp14="http://schemas.microsoft.com/office/word/2010/wordprocessingDrawing" xmlns:wp="http://schemas.openxmlformats.org/drawingml/2006/wordprocessingDrawing" xmlns:w10="urn:schemas-microsoft-com:office:word" xmlns:w="http://schemas.openxmlformats.org/wordprocessingml/2006/main" xmlns:w14="http://schemas.microsoft.com/office/word/2010/wordml" xmlns:w15="http://schemas.microsoft.com/office/word/2012/wordml" xmlns:w16cex="http://schemas.microsoft.com/office/word/2018/wordml/cex" xmlns:w16cid="http://schemas.microsoft.com/office/word/2016/wordml/cid" xmlns:w16="http://schemas.microsoft.com/office/word/2018/wordml" xmlns:w16du="http://schemas.microsoft.com/office/word/2023/wordml/word16du" xmlns:w16sdtdh="http://schemas.microsoft.com/office/word/2020/wordml/sdtdatahash" xmlns:w16sdtfl="http://schemas.microsoft.com/office/word/2024/wordml/sdtformatlock" xmlns:w16se="http://schemas.microsoft.com/office/word/2015/wordml/symex" xmlns:wpg="http://schemas.microsoft.com/office/word/2010/wordprocessingGroup" xmlns:wpi="http://schemas.microsoft.com/office/word/2010/wordprocessingInk" xmlns:wne="http://schemas.microsoft.com/office/word/2006/wordml" xmlns:wps="http://schemas.microsoft.com/office/word/2010/wordprocessingShape" mc:Ignorable="w14 w15 w16se w16cid w16 w16cex w16sdtdh w16sdtfl w16du wp14">
   <w:body>
     <w:p>
       <w:pPr>
@@ -79,7 +79,7 @@
           <w:szCs w:val="26"/>
         </w:rPr>
         <w:drawing>
-          <wp:inline distT="0" distB="0" distL="0" distR="0" wp14:anchorId="61AA30EF" wp14:editId="10A48B53">
+          <wp:inline distT="0" distB="0" distL="0" distR="0" wp14:anchorId="61AA30EF" wp14:editId="0C323E1F">
             <wp:extent cx="1948539" cy="1606164"/>
             <wp:effectExtent l="0" t="0" r="0" b="0"/>
             <wp:docPr id="990850389" name="Picture 1"/>
@@ -145,6 +145,7 @@
           <w:bCs/>
           <w:sz w:val="36"/>
           <w:szCs w:val="36"/>
+          <w:lang w:val="vi-VN"/>
         </w:rPr>
       </w:pPr>
       <w:r>
@@ -157,18 +158,41 @@
         </w:rPr>
         <w:t>BÁO CÁO ĐỒ ÁN MÔN HỌC</w:t>
       </w:r>
+      <w:r>
+        <w:rPr>
+          <w:rFonts w:cs="Times New Roman"/>
+          <w:b/>
+          <w:bCs/>
+          <w:sz w:val="36"/>
+          <w:szCs w:val="36"/>
+          <w:lang w:val="vi-VN"/>
+        </w:rPr>
+        <w:t xml:space="preserve"> </w:t>
+      </w:r>
     </w:p>
     <w:p>
       <w:pPr>
         <w:pStyle w:val="Title"/>
-      </w:pPr>
-      <w:r>
+        <w:rPr>
+          <w:lang w:val="vi-VN"/>
+        </w:rPr>
+      </w:pPr>
+      <w:r>
+        <w:rPr>
+          <w:lang w:val="vi-VN"/>
+        </w:rPr>
         <w:t>ĐỀ TÀI:</w:t>
       </w:r>
       <w:r>
+        <w:rPr>
+          <w:lang w:val="vi-VN"/>
+        </w:rPr>
         <w:t xml:space="preserve"> </w:t>
       </w:r>
       <w:r>
+        <w:rPr>
+          <w:lang w:val="vi-VN"/>
+        </w:rPr>
         <w:t xml:space="preserve">HỆ THỐNG </w:t>
       </w:r>
     </w:p>
@@ -176,14 +200,23 @@
       <w:pPr>
         <w:pStyle w:val="Title"/>
         <w:jc w:val="left"/>
-      </w:pPr>
-      <w:r>
+        <w:rPr>
+          <w:lang w:val="vi-VN"/>
+        </w:rPr>
+      </w:pPr>
+      <w:r>
+        <w:rPr>
+          <w:lang w:val="vi-VN"/>
+        </w:rPr>
         <w:t>THÔNG TIN GIẢI QUYẾT THỦ TỤC HÀNH CHÍNH</w:t>
       </w:r>
     </w:p>
     <w:p>
       <w:pPr>
         <w:pStyle w:val="Title"/>
+        <w:rPr>
+          <w:lang w:val="vi-VN"/>
+        </w:rPr>
       </w:pPr>
     </w:p>
     <w:p>
@@ -193,6 +226,7 @@
           <w:b/>
           <w:bCs/>
           <w:szCs w:val="26"/>
+          <w:lang w:val="vi-VN"/>
         </w:rPr>
       </w:pPr>
     </w:p>
@@ -203,6 +237,7 @@
           <w:b/>
           <w:bCs/>
           <w:szCs w:val="26"/>
+          <w:lang w:val="vi-VN"/>
         </w:rPr>
       </w:pPr>
       <w:r>
@@ -211,6 +246,7 @@
           <w:b/>
           <w:bCs/>
           <w:szCs w:val="26"/>
+          <w:lang w:val="vi-VN"/>
         </w:rPr>
         <w:t xml:space="preserve">Môn học: </w:t>
       </w:r>
@@ -218,36 +254,33 @@
         <w:rPr>
           <w:rFonts w:cs="Times New Roman"/>
           <w:szCs w:val="26"/>
-        </w:rPr>
-        <w:t>IE203.F34.LT.CNTT</w:t>
+          <w:lang w:val="vi-VN"/>
+        </w:rPr>
+        <w:t xml:space="preserve">IE203.F34.LT.CNTT </w:t>
       </w:r>
       <w:r>
         <w:rPr>
           <w:rFonts w:cs="Times New Roman"/>
           <w:szCs w:val="26"/>
-        </w:rPr>
-        <w:t xml:space="preserve"> </w:t>
+          <w:lang w:val="vi-VN"/>
+        </w:rPr>
+        <w:t xml:space="preserve">- </w:t>
       </w:r>
       <w:r>
         <w:rPr>
           <w:rFonts w:cs="Times New Roman"/>
           <w:szCs w:val="26"/>
-        </w:rPr>
-        <w:t xml:space="preserve">- </w:t>
-      </w:r>
-      <w:r>
+          <w:lang w:val="vi-VN"/>
+        </w:rPr>
+        <w:t>Hệ thống quản trị qui trình nghiệp vụ</w:t>
+      </w:r>
+    </w:p>
+    <w:p>
+      <w:pPr>
         <w:rPr>
           <w:rFonts w:cs="Times New Roman"/>
           <w:szCs w:val="26"/>
-        </w:rPr>
-        <w:t>Hệ thống quản trị qui trình nghiệp vụ</w:t>
-      </w:r>
-    </w:p>
-    <w:p>
-      <w:pPr>
-        <w:rPr>
-          <w:rFonts w:cs="Times New Roman"/>
-          <w:szCs w:val="26"/>
+          <w:lang w:val="vi-VN"/>
         </w:rPr>
       </w:pPr>
       <w:r>
@@ -256,6 +289,7 @@
           <w:b/>
           <w:bCs/>
           <w:szCs w:val="26"/>
+          <w:lang w:val="vi-VN"/>
         </w:rPr>
         <w:t>Giảng viên hướng dẫn:</w:t>
       </w:r>
@@ -265,6 +299,7 @@
           <w:b/>
           <w:bCs/>
           <w:szCs w:val="26"/>
+          <w:lang w:val="vi-VN"/>
         </w:rPr>
         <w:t xml:space="preserve"> </w:t>
       </w:r>
@@ -272,15 +307,9 @@
         <w:rPr>
           <w:rFonts w:cs="Times New Roman"/>
           <w:szCs w:val="26"/>
-        </w:rPr>
-        <w:t>ThS.</w:t>
-      </w:r>
-      <w:r>
-        <w:rPr>
-          <w:rFonts w:cs="Times New Roman"/>
-          <w:szCs w:val="26"/>
-        </w:rPr>
-        <w:t xml:space="preserve"> Hà Lê Hoài Trung</w:t>
+          <w:lang w:val="vi-VN"/>
+        </w:rPr>
+        <w:t>ThS. Hà Lê Hoài Trung</w:t>
       </w:r>
     </w:p>
     <w:p>
@@ -290,6 +319,7 @@
           <w:b/>
           <w:bCs/>
           <w:szCs w:val="26"/>
+          <w:lang w:val="vi-VN"/>
         </w:rPr>
       </w:pPr>
       <w:r>
@@ -298,6 +328,7 @@
           <w:b/>
           <w:bCs/>
           <w:szCs w:val="26"/>
+          <w:lang w:val="vi-VN"/>
         </w:rPr>
         <w:t xml:space="preserve">Thực hiện bởi nhóm </w:t>
       </w:r>
@@ -307,6 +338,7 @@
           <w:b/>
           <w:bCs/>
           <w:szCs w:val="26"/>
+          <w:lang w:val="vi-VN"/>
         </w:rPr>
         <w:t>7</w:t>
       </w:r>
@@ -316,6 +348,7 @@
           <w:b/>
           <w:bCs/>
           <w:szCs w:val="26"/>
+          <w:lang w:val="vi-VN"/>
         </w:rPr>
         <w:t>, bao gồm:</w:t>
       </w:r>
@@ -325,6 +358,7 @@
           <w:b/>
           <w:bCs/>
           <w:szCs w:val="26"/>
+          <w:lang w:val="vi-VN"/>
         </w:rPr>
         <w:t xml:space="preserve"> </w:t>
       </w:r>
@@ -3286,7 +3320,6 @@
       </w:pPr>
       <w:bookmarkStart w:id="1" w:name="_Toc236682190"/>
       <w:r>
-        <w:lastRenderedPageBreak/>
         <w:t>DANH SÁCH HÌNH</w:t>
       </w:r>
       <w:r>
@@ -3535,7 +3568,6 @@
           <w:sz w:val="30"/>
           <w:szCs w:val="30"/>
         </w:rPr>
-        <w:lastRenderedPageBreak/>
         <w:t>TÓM TẮT</w:t>
       </w:r>
     </w:p>
@@ -3678,11 +3710,7 @@
         <w:jc w:val="both"/>
       </w:pPr>
       <w:r>
-        <w:t xml:space="preserve">Sau khi sáp nhập, phạm vi quản lý được mở rộng, thông tin của người dân cần được cập nhật và chia sẻ trên hệ thống dữ liệu điện tử thống nhất. Điều này đòi hỏi các quy trình giải quyết thủ tục hành chính, bao gồm cả hình thức trực tiếp và trực tuyến, </w:t>
-      </w:r>
-      <w:r>
-        <w:lastRenderedPageBreak/>
-        <w:t xml:space="preserve">phải được rà soát, chuẩn hóa và thiết kế lại nhằm bảo đảm tính thống nhất, hạn chế sai sót trong quá trình xử lý hồ sơ, đồng thời tạo thuận lợi cho người dân và cơ quan quản lý. </w:t>
+        <w:t xml:space="preserve">Sau khi sáp nhập, phạm vi quản lý được mở rộng, thông tin của người dân cần được cập nhật và chia sẻ trên hệ thống dữ liệu điện tử thống nhất. Điều này đòi hỏi các quy trình giải quyết thủ tục hành chính, bao gồm cả hình thức trực tiếp và trực tuyến, phải được rà soát, chuẩn hóa và thiết kế lại nhằm bảo đảm tính thống nhất, hạn chế sai sót trong quá trình xử lý hồ sơ, đồng thời tạo thuận lợi cho người dân và cơ quan quản lý. </w:t>
       </w:r>
     </w:p>
     <w:p>
@@ -3855,7 +3883,6 @@
         <w:rPr>
           <w:b/>
         </w:rPr>
-        <w:lastRenderedPageBreak/>
         <w:t>Phạm vi nghiên cứu</w:t>
       </w:r>
       <w:r>
@@ -4050,7 +4077,6 @@
       </w:pPr>
       <w:bookmarkStart w:id="9" w:name="_Toc236682198"/>
       <w:r>
-        <w:lastRenderedPageBreak/>
         <w:t>2. Cơ sở lý thuyết.</w:t>
       </w:r>
       <w:bookmarkEnd w:id="9"/>
@@ -4136,7 +4162,6 @@
       <w:bookmarkStart w:id="10" w:name="_Toc236264118"/>
       <w:bookmarkStart w:id="11" w:name="_Toc236682199"/>
       <w:r>
-        <w:lastRenderedPageBreak/>
         <w:t>Chương II.</w:t>
       </w:r>
       <w:r>
@@ -4289,7 +4314,7 @@
               </wp:anchor>
             </w:drawing>
           </mc:Choice>
-          <mc:Fallback>
+          <mc:Fallback xmlns:w16cei="http://schemas.microsoft.com/office/word/2026/wordml/cei">
             <w:pict>
               <v:shapetype w14:anchorId="78A7AF05" id="_x0000_t5" coordsize="21600,21600" o:spt="5" adj="10800" path="m@0,l,21600r21600,xe">
                 <v:stroke joinstyle="miter"/>
@@ -4401,7 +4426,7 @@
               </wp:anchor>
             </w:drawing>
           </mc:Choice>
-          <mc:Fallback>
+          <mc:Fallback xmlns:w16cei="http://schemas.microsoft.com/office/word/2026/wordml/cei">
             <w:pict>
               <v:roundrect w14:anchorId="28E19EA2" id="Rectangle: Rounded Corners 3" o:spid="_x0000_s1026" style="position:absolute;margin-left:128.3pt;margin-top:15.9pt;width:107.35pt;height:63.3pt;z-index:251660288;visibility:visible;mso-wrap-style:square;mso-width-percent:0;mso-height-percent:0;mso-wrap-distance-left:9pt;mso-wrap-distance-top:0;mso-wrap-distance-right:9pt;mso-wrap-distance-bottom:0;mso-position-horizontal:absolute;mso-position-horizontal-relative:margin;mso-position-vertical:absolute;mso-position-vertical-relative:text;mso-width-percent:0;mso-height-percent:0;mso-width-relative:margin;mso-height-relative:margin;v-text-anchor:middle" arcsize="10923f" o:gfxdata="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" fillcolor="white [3201]" strokecolor="#e97132 [3205]" strokeweight="1pt">
                 <v:stroke joinstyle="miter"/>
@@ -4509,7 +4534,7 @@
               </wp:anchor>
             </w:drawing>
           </mc:Choice>
-          <mc:Fallback>
+          <mc:Fallback xmlns:w16cei="http://schemas.microsoft.com/office/word/2026/wordml/cei">
             <w:pict>
               <v:roundrect w14:anchorId="06A50C2F" id="_x0000_s1027" style="position:absolute;margin-left:238.75pt;margin-top:15.6pt;width:108pt;height:64.8pt;z-index:251661312;visibility:visible;mso-wrap-style:square;mso-width-percent:0;mso-height-percent:0;mso-wrap-distance-left:9pt;mso-wrap-distance-top:0;mso-wrap-distance-right:9pt;mso-wrap-distance-bottom:0;mso-position-horizontal:absolute;mso-position-horizontal-relative:margin;mso-position-vertical:absolute;mso-position-vertical-relative:text;mso-width-percent:0;mso-height-percent:0;mso-width-relative:margin;mso-height-relative:margin;v-text-anchor:middle" arcsize="10923f" o:gfxdata="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" fillcolor="white [3201]" strokecolor="#e97132 [3205]" strokeweight="1pt">
                 <v:stroke joinstyle="miter"/>
@@ -4611,7 +4636,7 @@
               </wp:anchor>
             </w:drawing>
           </mc:Choice>
-          <mc:Fallback>
+          <mc:Fallback xmlns:w16cei="http://schemas.microsoft.com/office/word/2026/wordml/cei">
             <w:pict>
               <v:roundrect w14:anchorId="65CEDB10" id="_x0000_s1028" style="position:absolute;margin-left:98.7pt;margin-top:27.4pt;width:136.8pt;height:50.4pt;z-index:251662336;visibility:visible;mso-wrap-style:square;mso-width-percent:0;mso-height-percent:0;mso-wrap-distance-left:9pt;mso-wrap-distance-top:0;mso-wrap-distance-right:9pt;mso-wrap-distance-bottom:0;mso-position-horizontal:absolute;mso-position-horizontal-relative:margin;mso-position-vertical:absolute;mso-position-vertical-relative:text;mso-width-percent:0;mso-height-percent:0;mso-width-relative:margin;mso-height-relative:margin;v-text-anchor:middle" arcsize="10923f" o:gfxdata="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" fillcolor="white [3201]" strokecolor="#e97132 [3205]" strokeweight="1pt">
                 <v:stroke joinstyle="miter"/>
@@ -4712,7 +4737,7 @@
               </wp:anchor>
             </w:drawing>
           </mc:Choice>
-          <mc:Fallback>
+          <mc:Fallback xmlns:w16cei="http://schemas.microsoft.com/office/word/2026/wordml/cei">
             <w:pict>
               <v:roundrect w14:anchorId="43DFB7C4" id="_x0000_s1029" style="position:absolute;margin-left:238.25pt;margin-top:.7pt;width:136.8pt;height:50.4pt;z-index:251664384;visibility:visible;mso-wrap-style:square;mso-width-percent:0;mso-height-percent:0;mso-wrap-distance-left:9pt;mso-wrap-distance-top:0;mso-wrap-distance-right:9pt;mso-wrap-distance-bottom:0;mso-position-horizontal:absolute;mso-position-horizontal-relative:margin;mso-position-vertical:absolute;mso-position-vertical-relative:text;mso-width-percent:0;mso-height-percent:0;mso-width-relative:margin;mso-height-relative:margin;v-text-anchor:middle" arcsize="10923f" o:gfxdata="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" fillcolor="white [3201]" strokecolor="#e97132 [3205]" strokeweight="1pt">
                 <v:stroke joinstyle="miter"/>
@@ -4826,7 +4851,7 @@
               </wp:anchor>
             </w:drawing>
           </mc:Choice>
-          <mc:Fallback>
+          <mc:Fallback xmlns:w16cei="http://schemas.microsoft.com/office/word/2026/wordml/cei">
             <w:pict>
               <v:rect w14:anchorId="39A2F26E" id="Rectangle 9" o:spid="_x0000_s1030" style="position:absolute;margin-left:0;margin-top:17pt;width:148.2pt;height:26.25pt;z-index:251663360;visibility:visible;mso-wrap-style:square;mso-width-percent:0;mso-height-percent:0;mso-wrap-distance-left:9pt;mso-wrap-distance-top:0;mso-wrap-distance-right:9pt;mso-wrap-distance-bottom:0;mso-position-horizontal:absolute;mso-position-horizontal-relative:margin;mso-position-vertical:absolute;mso-position-vertical-relative:text;mso-width-percent:0;mso-height-percent:0;mso-width-relative:margin;mso-height-relative:margin;v-text-anchor:middle" o:gfxdata="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" filled="f" stroked="f">
                 <v:textbox>
@@ -4945,7 +4970,7 @@
               </wp:anchor>
             </w:drawing>
           </mc:Choice>
-          <mc:Fallback>
+          <mc:Fallback xmlns:w16cei="http://schemas.microsoft.com/office/word/2026/wordml/cei">
             <w:pict>
               <v:rect w14:anchorId="6A75F3DE" id="Rectangle 10" o:spid="_x0000_s1031" style="position:absolute;margin-left:-17pt;margin-top:16.5pt;width:507.2pt;height:145.5pt;z-index:251665408;visibility:visible;mso-wrap-style:square;mso-width-percent:0;mso-height-percent:0;mso-wrap-distance-left:9pt;mso-wrap-distance-top:0;mso-wrap-distance-right:9pt;mso-wrap-distance-bottom:0;mso-position-horizontal:absolute;mso-position-horizontal-relative:margin;mso-position-vertical:absolute;mso-position-vertical-relative:text;mso-width-percent:0;mso-height-percent:0;mso-width-relative:margin;mso-height-relative:margin;v-text-anchor:middle" o:gfxdata="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" fillcolor="#8dd873 [1945]" strokecolor="white [3212]" strokeweight=".5pt">
                 <v:textbox>
@@ -5047,7 +5072,7 @@
               </wp:anchor>
             </w:drawing>
           </mc:Choice>
-          <mc:Fallback>
+          <mc:Fallback xmlns:w16cei="http://schemas.microsoft.com/office/word/2026/wordml/cei">
             <w:pict>
               <v:roundrect w14:anchorId="4EA4580F" id="_x0000_s1032" style="position:absolute;margin-left:241.9pt;margin-top:25.7pt;width:136.8pt;height:50.4pt;z-index:251667456;visibility:visible;mso-wrap-style:square;mso-width-percent:0;mso-height-percent:0;mso-wrap-distance-left:9pt;mso-wrap-distance-top:0;mso-wrap-distance-right:9pt;mso-wrap-distance-bottom:0;mso-position-horizontal:absolute;mso-position-horizontal-relative:margin;mso-position-vertical:absolute;mso-position-vertical-relative:text;mso-width-percent:0;mso-height-percent:0;mso-width-relative:margin;mso-height-relative:margin;v-text-anchor:middle" arcsize="10923f" o:gfxdata="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" fillcolor="white [3201]" strokecolor="white [3212]" strokeweight="1pt">
                 <v:stroke joinstyle="miter"/>
@@ -5169,7 +5194,7 @@
               </wp:anchor>
             </w:drawing>
           </mc:Choice>
-          <mc:Fallback>
+          <mc:Fallback xmlns:w16cei="http://schemas.microsoft.com/office/word/2026/wordml/cei">
             <w:pict>
               <v:roundrect w14:anchorId="6BA0FAA7" id="_x0000_s1033" style="position:absolute;margin-left:94.6pt;margin-top:25.15pt;width:136.8pt;height:50.4pt;z-index:251666432;visibility:visible;mso-wrap-style:square;mso-width-percent:0;mso-height-percent:0;mso-wrap-distance-left:9pt;mso-wrap-distance-top:0;mso-wrap-distance-right:9pt;mso-wrap-distance-bottom:0;mso-position-horizontal:absolute;mso-position-horizontal-relative:margin;mso-position-vertical:absolute;mso-position-vertical-relative:text;mso-width-percent:0;mso-height-percent:0;mso-width-relative:margin;mso-height-relative:margin;v-text-anchor:middle" arcsize="10923f" o:gfxdata="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" fillcolor="white [3201]" strokecolor="white [3212]" strokeweight="1pt">
                 <v:stroke joinstyle="miter"/>
@@ -5302,7 +5327,7 @@
               </wp:anchor>
             </w:drawing>
           </mc:Choice>
-          <mc:Fallback>
+          <mc:Fallback xmlns:w16cei="http://schemas.microsoft.com/office/word/2026/wordml/cei">
             <w:pict>
               <v:roundrect w14:anchorId="7ACD8C4B" id="_x0000_s1034" style="position:absolute;margin-left:240.45pt;margin-top:1.45pt;width:136.8pt;height:64.8pt;z-index:251672576;visibility:visible;mso-wrap-style:square;mso-width-percent:0;mso-height-percent:0;mso-wrap-distance-left:9pt;mso-wrap-distance-top:0;mso-wrap-distance-right:9pt;mso-wrap-distance-bottom:0;mso-position-horizontal:absolute;mso-position-horizontal-relative:margin;mso-position-vertical:absolute;mso-position-vertical-relative:text;mso-width-percent:0;mso-height-percent:0;mso-width-relative:margin;mso-height-relative:margin;v-text-anchor:middle" arcsize="10923f" o:gfxdata="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" fillcolor="white [3201]" strokecolor="white [3212]" strokeweight="1pt">
                 <v:stroke joinstyle="miter"/>
@@ -5413,7 +5438,7 @@
               </wp:anchor>
             </w:drawing>
           </mc:Choice>
-          <mc:Fallback>
+          <mc:Fallback xmlns:w16cei="http://schemas.microsoft.com/office/word/2026/wordml/cei">
             <w:pict>
               <v:roundrect w14:anchorId="2A1E14F2" id="_x0000_s1035" style="position:absolute;margin-left:94.5pt;margin-top:.8pt;width:136.8pt;height:64.8pt;z-index:251668480;visibility:visible;mso-wrap-style:square;mso-width-percent:0;mso-height-percent:0;mso-wrap-distance-left:9pt;mso-wrap-distance-top:0;mso-wrap-distance-right:9pt;mso-wrap-distance-bottom:0;mso-position-horizontal:absolute;mso-position-horizontal-relative:margin;mso-position-vertical:absolute;mso-position-vertical-relative:text;mso-width-percent:0;mso-height-percent:0;mso-width-relative:margin;mso-height-relative:margin;v-text-anchor:middle" arcsize="10923f" o:gfxdata="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" fillcolor="white [3201]" strokecolor="white [3212]" strokeweight="1pt">
                 <v:stroke joinstyle="miter"/>
@@ -5529,7 +5554,7 @@
               </wp:anchor>
             </w:drawing>
           </mc:Choice>
-          <mc:Fallback>
+          <mc:Fallback xmlns:w16cei="http://schemas.microsoft.com/office/word/2026/wordml/cei">
             <w:pict>
               <v:rect w14:anchorId="74F3C5D9" id="Rectangle 15" o:spid="_x0000_s1036" style="position:absolute;margin-left:-17.95pt;margin-top:31.05pt;width:507.85pt;height:139.85pt;z-index:251669504;visibility:visible;mso-wrap-style:square;mso-width-percent:0;mso-height-percent:0;mso-wrap-distance-left:9pt;mso-wrap-distance-top:0;mso-wrap-distance-right:9pt;mso-wrap-distance-bottom:0;mso-position-horizontal:absolute;mso-position-horizontal-relative:margin;mso-position-vertical:absolute;mso-position-vertical-relative:text;mso-width-percent:0;mso-height-percent:0;mso-width-relative:margin;mso-height-relative:margin;v-text-anchor:middle" o:gfxdata="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" fillcolor="#4e95d9 [1631]" strokecolor="white [3212]">
                 <v:stroke joinstyle="round"/>
@@ -5640,7 +5665,7 @@
               </wp:anchor>
             </w:drawing>
           </mc:Choice>
-          <mc:Fallback>
+          <mc:Fallback xmlns:w16cei="http://schemas.microsoft.com/office/word/2026/wordml/cei">
             <w:pict>
               <v:rect w14:anchorId="01CA98DA" id="_x0000_s1037" style="position:absolute;margin-left:0;margin-top:6pt;width:128.35pt;height:26.25pt;z-index:251673600;visibility:visible;mso-wrap-style:square;mso-width-percent:0;mso-height-percent:0;mso-wrap-distance-left:9pt;mso-wrap-distance-top:0;mso-wrap-distance-right:9pt;mso-wrap-distance-bottom:0;mso-position-horizontal:left;mso-position-horizontal-relative:margin;mso-position-vertical:absolute;mso-position-vertical-relative:text;mso-width-percent:0;mso-height-percent:0;mso-width-relative:margin;mso-height-relative:margin;v-text-anchor:middle" o:gfxdata="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" filled="f" stroked="f">
                 <v:textbox>
@@ -5771,7 +5796,7 @@
               </wp:anchor>
             </w:drawing>
           </mc:Choice>
-          <mc:Fallback>
+          <mc:Fallback xmlns:w16cei="http://schemas.microsoft.com/office/word/2026/wordml/cei">
             <w:pict>
               <v:roundrect w14:anchorId="1A0728D7" id="_x0000_s1038" style="position:absolute;margin-left:13.85pt;margin-top:13.5pt;width:136.8pt;height:50.4pt;z-index:251676672;visibility:visible;mso-wrap-style:square;mso-width-percent:0;mso-height-percent:0;mso-wrap-distance-left:9pt;mso-wrap-distance-top:0;mso-wrap-distance-right:9pt;mso-wrap-distance-bottom:0;mso-position-horizontal:absolute;mso-position-horizontal-relative:margin;mso-position-vertical:absolute;mso-position-vertical-relative:text;mso-width-percent:0;mso-height-percent:0;mso-width-relative:margin;mso-height-relative:margin;v-text-anchor:middle" arcsize="10923f" o:gfxdata="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" fillcolor="white [3212]" strokecolor="white [3212]" strokeweight="1pt">
                 <v:stroke joinstyle="miter"/>
@@ -5889,7 +5914,7 @@
               </wp:anchor>
             </w:drawing>
           </mc:Choice>
-          <mc:Fallback>
+          <mc:Fallback xmlns:w16cei="http://schemas.microsoft.com/office/word/2026/wordml/cei">
             <w:pict>
               <v:roundrect w14:anchorId="387F4A24" id="_x0000_s1039" style="position:absolute;margin-left:320.35pt;margin-top:13.5pt;width:136.8pt;height:50.4pt;z-index:251677696;visibility:visible;mso-wrap-style:square;mso-width-percent:0;mso-height-percent:0;mso-wrap-distance-left:9pt;mso-wrap-distance-top:0;mso-wrap-distance-right:9pt;mso-wrap-distance-bottom:0;mso-position-horizontal:absolute;mso-position-horizontal-relative:margin;mso-position-vertical:absolute;mso-position-vertical-relative:text;mso-width-percent:0;mso-height-percent:0;mso-width-relative:margin;mso-height-relative:margin;v-text-anchor:middle" arcsize="10923f" o:gfxdata="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" fillcolor="white [3201]" strokecolor="white [3212]" strokeweight="1pt">
                 <v:stroke joinstyle="miter"/>
@@ -6000,7 +6025,7 @@
               </wp:anchor>
             </w:drawing>
           </mc:Choice>
-          <mc:Fallback>
+          <mc:Fallback xmlns:w16cei="http://schemas.microsoft.com/office/word/2026/wordml/cei">
             <w:pict>
               <v:roundrect w14:anchorId="32BCDBDA" id="_x0000_s1040" style="position:absolute;margin-left:167.55pt;margin-top:13.5pt;width:136.8pt;height:50.4pt;z-index:251671552;visibility:visible;mso-wrap-style:square;mso-width-percent:0;mso-height-percent:0;mso-wrap-distance-left:9pt;mso-wrap-distance-top:0;mso-wrap-distance-right:9pt;mso-wrap-distance-bottom:0;mso-position-horizontal:absolute;mso-position-horizontal-relative:margin;mso-position-vertical:absolute;mso-position-vertical-relative:text;mso-width-percent:0;mso-height-percent:0;mso-width-relative:margin;mso-height-relative:margin;v-text-anchor:middle" arcsize="10923f" o:gfxdata="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" fillcolor="white [3212]" strokecolor="white [3212]" strokeweight="1pt">
                 <v:stroke joinstyle="miter"/>
@@ -6111,7 +6136,7 @@
               </wp:anchor>
             </w:drawing>
           </mc:Choice>
-          <mc:Fallback>
+          <mc:Fallback xmlns:w16cei="http://schemas.microsoft.com/office/word/2026/wordml/cei">
             <w:pict>
               <v:roundrect w14:anchorId="657A6CDF" id="_x0000_s1041" style="position:absolute;margin-left:249.25pt;margin-top:17.25pt;width:136.8pt;height:50.4pt;z-index:251670528;visibility:visible;mso-wrap-style:square;mso-width-percent:0;mso-height-percent:0;mso-wrap-distance-left:9pt;mso-wrap-distance-top:0;mso-wrap-distance-right:9pt;mso-wrap-distance-bottom:0;mso-position-horizontal:absolute;mso-position-horizontal-relative:margin;mso-position-vertical:absolute;mso-position-vertical-relative:text;mso-width-percent:0;mso-height-percent:0;mso-width-relative:margin;mso-height-relative:margin;v-text-anchor:middle" arcsize="10923f" o:gfxdata="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" fillcolor="white [3201]" strokecolor="white [3212]" strokeweight="1pt">
                 <v:stroke joinstyle="miter"/>
@@ -6222,7 +6247,7 @@
               </wp:anchor>
             </w:drawing>
           </mc:Choice>
-          <mc:Fallback>
+          <mc:Fallback xmlns:w16cei="http://schemas.microsoft.com/office/word/2026/wordml/cei">
             <w:pict>
               <v:roundrect w14:anchorId="7D7BAB04" id="_x0000_s1042" style="position:absolute;margin-left:93.25pt;margin-top:17.25pt;width:136.8pt;height:50.4pt;z-index:251675648;visibility:visible;mso-wrap-style:square;mso-width-percent:0;mso-height-percent:0;mso-wrap-distance-left:9pt;mso-wrap-distance-top:0;mso-wrap-distance-right:9pt;mso-wrap-distance-bottom:0;mso-position-horizontal:absolute;mso-position-horizontal-relative:margin;mso-position-vertical:absolute;mso-position-vertical-relative:text;mso-width-percent:0;mso-height-percent:0;mso-width-relative:margin;mso-height-relative:margin;v-text-anchor:middle" arcsize="10923f" o:gfxdata="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" fillcolor="white [3212]" strokecolor="white [3212]" strokeweight="1pt">
                 <v:stroke joinstyle="miter"/>
@@ -6355,7 +6380,7 @@
               </wp:anchor>
             </w:drawing>
           </mc:Choice>
-          <mc:Fallback>
+          <mc:Fallback xmlns:w16cei="http://schemas.microsoft.com/office/word/2026/wordml/cei">
             <w:pict>
               <v:rect w14:anchorId="5D164BEA" id="_x0000_s1043" style="position:absolute;left:0;text-align:left;margin-left:0;margin-top:7.95pt;width:128.35pt;height:26.25pt;z-index:251674624;visibility:visible;mso-wrap-style:square;mso-width-percent:0;mso-height-percent:0;mso-wrap-distance-left:9pt;mso-wrap-distance-top:0;mso-wrap-distance-right:9pt;mso-wrap-distance-bottom:0;mso-position-horizontal:left;mso-position-horizontal-relative:margin;mso-position-vertical:absolute;mso-position-vertical-relative:text;mso-width-percent:0;mso-height-percent:0;mso-width-relative:margin;mso-height-relative:margin;v-text-anchor:middle" o:gfxdata="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" filled="f" stroked="f">
                 <v:textbox>
@@ -6394,7 +6419,6 @@
       <w:bookmarkStart w:id="18" w:name="_Toc236264122"/>
       <w:bookmarkStart w:id="19" w:name="_Toc236682203"/>
       <w:r>
-        <w:lastRenderedPageBreak/>
         <w:t>2.1.2 Quy trình quản lý (Processs Management).</w:t>
       </w:r>
       <w:bookmarkEnd w:id="18"/>
@@ -6605,11 +6629,7 @@
         <w:jc w:val="both"/>
       </w:pPr>
       <w:r>
-        <w:t xml:space="preserve">Xác nhận tiếp nhận: Nếu hồ sơ đáp ứng yêu cầu, cán bộ xác nhận tiếp nhận và chuyển hồ sơ sang bộ phận hoặc đơn vị nghiệp vụ để xử lý. Nếu hồ sơ chưa đầy đủ, cán </w:t>
-      </w:r>
-      <w:r>
-        <w:lastRenderedPageBreak/>
-        <w:t>bộ yêu cầu bổ sung; nếu không đủ điều kiện tiếp nhận, cán bộ từ chối và ghi rõ nội dung từ chối.</w:t>
+        <w:t>Xác nhận tiếp nhận: Nếu hồ sơ đáp ứng yêu cầu, cán bộ xác nhận tiếp nhận và chuyển hồ sơ sang bộ phận hoặc đơn vị nghiệp vụ để xử lý. Nếu hồ sơ chưa đầy đủ, cán bộ yêu cầu bổ sung; nếu không đủ điều kiện tiếp nhận, cán bộ từ chối và ghi rõ nội dung từ chối.</w:t>
       </w:r>
     </w:p>
     <w:p>
@@ -6844,7 +6864,6 @@
         <w:jc w:val="both"/>
       </w:pPr>
       <w:r>
-        <w:lastRenderedPageBreak/>
         <w:t>Cán bộ tiếp nhận hồ sơ, cán bộ chuyên môn, người dân hoặc tổ chức và hệ thống thông tin giải quyết thủ tục hành chính.</w:t>
       </w:r>
     </w:p>
@@ -7037,7 +7056,6 @@
       </w:pPr>
       <w:bookmarkStart w:id="28" w:name="_Toc236682206"/>
       <w:r>
-        <w:lastRenderedPageBreak/>
         <w:t xml:space="preserve">2.1.3.3 </w:t>
       </w:r>
       <w:bookmarkEnd w:id="26"/>
@@ -7358,7 +7376,6 @@
         <w:jc w:val="both"/>
       </w:pPr>
       <w:r>
-        <w:lastRenderedPageBreak/>
         <w:t>TÁC NHÂN THỰC HIỆN</w:t>
       </w:r>
     </w:p>
@@ -7559,11 +7576,7 @@
         </w:numPr>
       </w:pPr>
       <w:r>
-        <w:t xml:space="preserve">Tiếp nhận phản ánh, kiến nghị: Người dân hoặc tổ chức gửi phản ánh, kiến nghị thông qua Cổng Dịch vụ công, Hệ thống thông tin giải quyết thủ tục hành </w:t>
-      </w:r>
-      <w:r>
-        <w:lastRenderedPageBreak/>
-        <w:t>chính, trực tiếp, qua điện thoại, thư điện tử hoặc dịch vụ bưu chính. Hệ thống hoặc cán bộ tiếp nhận ghi nhận đầy đủ thông tin phản ánh.</w:t>
+        <w:t>Tiếp nhận phản ánh, kiến nghị: Người dân hoặc tổ chức gửi phản ánh, kiến nghị thông qua Cổng Dịch vụ công, Hệ thống thông tin giải quyết thủ tục hành chính, trực tiếp, qua điện thoại, thư điện tử hoặc dịch vụ bưu chính. Hệ thống hoặc cán bộ tiếp nhận ghi nhận đầy đủ thông tin phản ánh.</w:t>
       </w:r>
     </w:p>
     <w:p>
@@ -7927,7 +7940,6 @@
               <w:jc w:val="center"/>
             </w:pPr>
             <w:r>
-              <w:lastRenderedPageBreak/>
               <w:t>3</w:t>
             </w:r>
           </w:p>
@@ -8249,7 +8261,6 @@
       </w:pPr>
       <w:bookmarkStart w:id="36" w:name="_Toc236682210"/>
       <w:r>
-        <w:lastRenderedPageBreak/>
         <w:t>2.1.4.2 Thanh toán trực tuyến</w:t>
       </w:r>
       <w:bookmarkEnd w:id="36"/>
@@ -8446,7 +8457,6 @@
                 <w:b/>
                 <w:sz w:val="22"/>
               </w:rPr>
-              <w:lastRenderedPageBreak/>
               <w:t>STT</w:t>
             </w:r>
           </w:p>
@@ -8923,11 +8933,7 @@
           </w:tcPr>
           <w:p>
             <w:r>
-              <w:t xml:space="preserve">Có sự không thống nhất giữa dữ liệu </w:t>
-            </w:r>
-            <w:r>
-              <w:lastRenderedPageBreak/>
-              <w:t>của Cổng thanh toán, ngân hàng và Hệ thống thông tin giải quyết thủ tục hành chính</w:t>
+              <w:t>Có sự không thống nhất giữa dữ liệu của Cổng thanh toán, ngân hàng và Hệ thống thông tin giải quyết thủ tục hành chính</w:t>
             </w:r>
           </w:p>
         </w:tc>
@@ -8937,12 +8943,7 @@
           </w:tcPr>
           <w:p>
             <w:r>
-              <w:lastRenderedPageBreak/>
-              <w:t xml:space="preserve">Giao dịch được chuyển sang quy trình đối soát. </w:t>
-            </w:r>
-            <w:r>
-              <w:lastRenderedPageBreak/>
-              <w:t>Sau khi xác minh, hệ thống sẽ cập nhật trạng thái cuối cùng là thành công hoặc thất bại</w:t>
+              <w:t>Giao dịch được chuyển sang quy trình đối soát. Sau khi xác minh, hệ thống sẽ cập nhật trạng thái cuối cùng là thành công hoặc thất bại</w:t>
             </w:r>
           </w:p>
         </w:tc>
@@ -8952,7 +8953,6 @@
           </w:tcPr>
           <w:p>
             <w:r>
-              <w:lastRenderedPageBreak/>
               <w:t>Chờ đối soát</w:t>
             </w:r>
           </w:p>
@@ -9232,7 +9232,6 @@
         </w:numPr>
       </w:pPr>
       <w:r>
-        <w:lastRenderedPageBreak/>
         <w:t>Phát hành văn bản: Sau khi ký số thành công, hệ thống cấp số văn bản (nếu chưa có), phát hành văn bản điện tử đến người dân, tổ chức hoặc các cơ quan liên quan theo đúng phạm vi được quy định.</w:t>
       </w:r>
     </w:p>
@@ -9661,11 +9660,7 @@
           </w:tcPr>
           <w:p>
             <w:r>
-              <w:t xml:space="preserve">Văn bản đã được trình ký nhưng người có thẩm quyền chưa thực hiện ký hoặc đang </w:t>
-            </w:r>
-            <w:r>
-              <w:lastRenderedPageBreak/>
-              <w:t>trong thời hạn xử lý</w:t>
+              <w:t>Văn bản đã được trình ký nhưng người có thẩm quyền chưa thực hiện ký hoặc đang trong thời hạn xử lý</w:t>
             </w:r>
           </w:p>
         </w:tc>
@@ -9675,7 +9670,6 @@
           </w:tcPr>
           <w:p>
             <w:r>
-              <w:lastRenderedPageBreak/>
               <w:t>Đây là trạng thái trung gian trước khi hoàn tất ký số hoặc trả lại văn bản</w:t>
             </w:r>
           </w:p>
@@ -10048,11 +10042,7 @@
         </w:numPr>
       </w:pPr>
       <w:r>
-        <w:t xml:space="preserve">Tiếp nhận yêu cầu hỗ trợ: Người dân hoặc tổ chức liên hệ tổng đài thông qua điện thoại, thư điện tử, Cổng Dịch vụ công, chatbot hoặc các kênh hỗ trợ trực </w:t>
-      </w:r>
-      <w:r>
-        <w:lastRenderedPageBreak/>
-        <w:t>tuyến khác để yêu cầu hỗ trợ hoặc giải đáp thắc mắc. Hệ thống ghi nhận thông tin và tạo yêu cầu hỗ trợ.</w:t>
+        <w:t>Tiếp nhận yêu cầu hỗ trợ: Người dân hoặc tổ chức liên hệ tổng đài thông qua điện thoại, thư điện tử, Cổng Dịch vụ công, chatbot hoặc các kênh hỗ trợ trực tuyến khác để yêu cầu hỗ trợ hoặc giải đáp thắc mắc. Hệ thống ghi nhận thông tin và tạo yêu cầu hỗ trợ.</w:t>
       </w:r>
     </w:p>
     <w:p>
@@ -10422,11 +10412,7 @@
           </w:tcPr>
           <w:p>
             <w:r>
-              <w:t xml:space="preserve">Đơn vị chuyên môn đang xem xét, </w:t>
-            </w:r>
-            <w:r>
-              <w:lastRenderedPageBreak/>
-              <w:t>xác minh hoặc khắc phục sự cố</w:t>
+              <w:t>Đơn vị chuyên môn đang xem xét, xác minh hoặc khắc phục sự cố</w:t>
             </w:r>
           </w:p>
         </w:tc>
@@ -10436,7 +10422,6 @@
           </w:tcPr>
           <w:p>
             <w:r>
-              <w:lastRenderedPageBreak/>
               <w:t>Đây là trạng thái trung gian, người dân có thể theo dõi tiến độ xử lý</w:t>
             </w:r>
           </w:p>
@@ -10832,7 +10817,6 @@
         <w:ind w:left="709" w:hanging="425"/>
       </w:pPr>
       <w:r>
-        <w:lastRenderedPageBreak/>
         <w:t>C</w:t>
       </w:r>
       <w:r>
@@ -11190,11 +11174,7 @@
           </w:tcPr>
           <w:p>
             <w:r>
-              <w:t xml:space="preserve">Không phát hiện sự cố hoặc sự cố đã được khắc phục hoàn toàn và các </w:t>
-            </w:r>
-            <w:r>
-              <w:lastRenderedPageBreak/>
-              <w:t>chức năng hoạt động bình thường</w:t>
+              <w:t>Không phát hiện sự cố hoặc sự cố đã được khắc phục hoàn toàn và các chức năng hoạt động bình thường</w:t>
             </w:r>
           </w:p>
         </w:tc>
@@ -11204,7 +11184,6 @@
           </w:tcPr>
           <w:p>
             <w:r>
-              <w:lastRenderedPageBreak/>
               <w:t>Hệ thống sẵn sàng phục vụ người sử dụng và các dịch vụ được cung cấp liên tục</w:t>
             </w:r>
           </w:p>
@@ -11646,11 +11625,7 @@
           </w:tcPr>
           <w:p>
             <w:r>
-              <w:t xml:space="preserve">Sau khi hoàn tất xử lý hoặc kết thúc bảo trì, toàn bộ nhật ký, báo cáo và lịch sử thao tác </w:t>
-            </w:r>
-            <w:r>
-              <w:lastRenderedPageBreak/>
-              <w:t>được lưu trên hệ thống</w:t>
+              <w:t>Sau khi hoàn tất xử lý hoặc kết thúc bảo trì, toàn bộ nhật ký, báo cáo và lịch sử thao tác được lưu trên hệ thống</w:t>
             </w:r>
           </w:p>
         </w:tc>
@@ -11660,7 +11635,6 @@
           </w:tcPr>
           <w:p>
             <w:r>
-              <w:lastRenderedPageBreak/>
               <w:t>Đây là trạng thái cuối cùng của quy trình, phục vụ kiểm tra, đánh giá, kiểm toán và nâng cao chất lượng vận hành</w:t>
             </w:r>
           </w:p>
@@ -12271,7 +12245,6 @@
                 <w:color w:val="000000"/>
                 <w:sz w:val="23"/>
               </w:rPr>
-              <w:lastRenderedPageBreak/>
               <w:t>4</w:t>
             </w:r>
           </w:p>
@@ -12947,7 +12920,6 @@
                 <w:color w:val="000000"/>
                 <w:sz w:val="23"/>
               </w:rPr>
-              <w:lastRenderedPageBreak/>
               <w:t>10</w:t>
             </w:r>
           </w:p>
@@ -13772,7 +13744,6 @@
                 <w:color w:val="000000"/>
                 <w:sz w:val="23"/>
               </w:rPr>
-              <w:lastRenderedPageBreak/>
               <w:t>18</w:t>
             </w:r>
           </w:p>
@@ -14065,7 +14036,6 @@
       </w:pPr>
       <w:bookmarkStart w:id="46" w:name="_Toc236682218"/>
       <w:r>
-        <w:lastRenderedPageBreak/>
         <w:t>2.3.2 Mô hình hóa quy trình kiểm tra, thẩm định và xử lý hồ sơ</w:t>
       </w:r>
       <w:bookmarkEnd w:id="46"/>
@@ -14111,10 +14081,10 @@
           <w:lang w:val="vi-VN"/>
         </w:rPr>
         <w:drawing>
-          <wp:inline distT="0" distB="0" distL="0" distR="0" wp14:anchorId="2EDCB889" wp14:editId="5571FA84">
-            <wp:extent cx="5731510" cy="4935220"/>
-            <wp:effectExtent l="0" t="0" r="2540" b="0"/>
-            <wp:docPr id="397890916" name="Picture 20"/>
+          <wp:inline distT="0" distB="0" distL="0" distR="0" wp14:anchorId="111A9E23" wp14:editId="155A33C0">
+            <wp:extent cx="5731510" cy="4932680"/>
+            <wp:effectExtent l="0" t="0" r="2540" b="1270"/>
+            <wp:docPr id="825447149" name="Picture 20"/>
             <wp:cNvGraphicFramePr>
               <a:graphicFrameLocks xmlns:a="http://schemas.openxmlformats.org/drawingml/2006/main" noChangeAspect="1"/>
             </wp:cNvGraphicFramePr>
@@ -14122,7 +14092,7 @@
               <a:graphicData uri="http://schemas.openxmlformats.org/drawingml/2006/picture">
                 <pic:pic xmlns:pic="http://schemas.openxmlformats.org/drawingml/2006/picture">
                   <pic:nvPicPr>
-                    <pic:cNvPr id="397890916" name="Picture 397890916"/>
+                    <pic:cNvPr id="825447149" name="Picture 825447149"/>
                     <pic:cNvPicPr/>
                   </pic:nvPicPr>
                   <pic:blipFill>
@@ -14140,7 +14110,7 @@
                   <pic:spPr>
                     <a:xfrm>
                       <a:off x="0" y="0"/>
-                      <a:ext cx="5731510" cy="4935220"/>
+                      <a:ext cx="5731510" cy="4932680"/>
                     </a:xfrm>
                     <a:prstGeom prst="rect">
                       <a:avLst/>
@@ -14784,7 +14754,6 @@
                 <w:szCs w:val="24"/>
                 <w14:ligatures w14:val="none"/>
               </w:rPr>
-              <w:lastRenderedPageBreak/>
               <w:t>5</w:t>
             </w:r>
           </w:p>
@@ -16672,7 +16641,6 @@
                 <w:szCs w:val="24"/>
                 <w14:ligatures w14:val="none"/>
               </w:rPr>
-              <w:lastRenderedPageBreak/>
               <w:t>22</w:t>
             </w:r>
           </w:p>
@@ -19768,7 +19736,6 @@
                 <w:szCs w:val="24"/>
                 <w14:ligatures w14:val="none"/>
               </w:rPr>
-              <w:lastRenderedPageBreak/>
               <w:t>19</w:t>
             </w:r>
           </w:p>
@@ -23105,7 +23072,6 @@
                 <w:szCs w:val="24"/>
                 <w14:ligatures w14:val="none"/>
               </w:rPr>
-              <w:lastRenderedPageBreak/>
               <w:t>43</w:t>
             </w:r>
           </w:p>
@@ -26073,7 +26039,145 @@
                 <w:szCs w:val="24"/>
                 <w14:ligatures w14:val="none"/>
               </w:rPr>
-              <w:t xml:space="preserve">A. Nội dung PAKN; B. Đơn vị có thẩm quyền; </w:t>
+              <w:t>A. Nội dung PAKN; B. Đơn vị có thẩm quyền; C. Cả nội dung và thẩm quyền; D. Yếu tố khác.</w:t>
+            </w:r>
+          </w:p>
+        </w:tc>
+        <w:tc>
+          <w:tcPr>
+            <w:tcW w:w="0" w:type="auto"/>
+            <w:hideMark/>
+          </w:tcPr>
+          <w:p>
+            <w:pPr>
+              <w:rPr>
+                <w:rFonts w:eastAsia="Times New Roman" w:cs="Times New Roman"/>
+                <w:kern w:val="0"/>
+                <w:sz w:val="24"/>
+                <w:szCs w:val="24"/>
+                <w14:ligatures w14:val="none"/>
+              </w:rPr>
+            </w:pPr>
+            <w:r>
+              <w:rPr>
+                <w:rFonts w:eastAsia="Times New Roman" w:cs="Times New Roman"/>
+                <w:kern w:val="0"/>
+                <w:sz w:val="24"/>
+                <w:szCs w:val="24"/>
+                <w14:ligatures w14:val="none"/>
+              </w:rPr>
+              <w:t>Cán bộ tiếp nhận PAKN</w:t>
+            </w:r>
+          </w:p>
+        </w:tc>
+        <w:tc>
+          <w:tcPr>
+            <w:tcW w:w="2493" w:type="dxa"/>
+            <w:hideMark/>
+          </w:tcPr>
+          <w:p>
+            <w:pPr>
+              <w:rPr>
+                <w:rFonts w:eastAsia="Times New Roman" w:cs="Times New Roman"/>
+                <w:kern w:val="0"/>
+                <w:sz w:val="24"/>
+                <w:szCs w:val="24"/>
+                <w14:ligatures w14:val="none"/>
+              </w:rPr>
+            </w:pPr>
+            <w:r>
+              <w:rPr>
+                <w:rFonts w:eastAsia="Times New Roman" w:cs="Times New Roman"/>
+                <w:kern w:val="0"/>
+                <w:sz w:val="24"/>
+                <w:szCs w:val="24"/>
+                <w14:ligatures w14:val="none"/>
+              </w:rPr>
+              <w:t>Xác định căn cứ thực tế được sử dụng để phân loại và xác định hướng xử lý PAKN.</w:t>
+            </w:r>
+          </w:p>
+        </w:tc>
+      </w:tr>
+      <w:tr>
+        <w:tc>
+          <w:tcPr>
+            <w:tcW w:w="670" w:type="dxa"/>
+            <w:hideMark/>
+          </w:tcPr>
+          <w:p>
+            <w:pPr>
+              <w:jc w:val="right"/>
+              <w:rPr>
+                <w:rFonts w:eastAsia="Times New Roman" w:cs="Times New Roman"/>
+                <w:kern w:val="0"/>
+                <w:sz w:val="24"/>
+                <w:szCs w:val="24"/>
+                <w14:ligatures w14:val="none"/>
+              </w:rPr>
+            </w:pPr>
+            <w:r>
+              <w:rPr>
+                <w:rFonts w:eastAsia="Times New Roman" w:cs="Times New Roman"/>
+                <w:kern w:val="0"/>
+                <w:sz w:val="24"/>
+                <w:szCs w:val="24"/>
+                <w14:ligatures w14:val="none"/>
+              </w:rPr>
+              <w:t>2</w:t>
+            </w:r>
+          </w:p>
+        </w:tc>
+        <w:tc>
+          <w:tcPr>
+            <w:tcW w:w="1580" w:type="dxa"/>
+            <w:hideMark/>
+          </w:tcPr>
+          <w:p>
+            <w:pPr>
+              <w:rPr>
+                <w:rFonts w:eastAsia="Times New Roman" w:cs="Times New Roman"/>
+                <w:kern w:val="0"/>
+                <w:sz w:val="24"/>
+                <w:szCs w:val="24"/>
+                <w14:ligatures w14:val="none"/>
+              </w:rPr>
+            </w:pPr>
+            <w:r>
+              <w:rPr>
+                <w:rFonts w:eastAsia="Times New Roman" w:cs="Times New Roman"/>
+                <w:kern w:val="0"/>
+                <w:sz w:val="24"/>
+                <w:szCs w:val="24"/>
+                <w14:ligatures w14:val="none"/>
+              </w:rPr>
+              <w:t>Có cấu trúc</w:t>
+            </w:r>
+          </w:p>
+        </w:tc>
+        <w:tc>
+          <w:tcPr>
+            <w:tcW w:w="3720" w:type="dxa"/>
+            <w:hideMark/>
+          </w:tcPr>
+          <w:p>
+            <w:pPr>
+              <w:rPr>
+                <w:rFonts w:eastAsia="Times New Roman" w:cs="Times New Roman"/>
+                <w:kern w:val="0"/>
+                <w:sz w:val="24"/>
+                <w:szCs w:val="24"/>
+                <w14:ligatures w14:val="none"/>
+              </w:rPr>
+            </w:pPr>
+            <w:r>
+              <w:rPr>
+                <w:rFonts w:eastAsia="Times New Roman" w:cs="Times New Roman"/>
+                <w:kern w:val="0"/>
+                <w:sz w:val="24"/>
+                <w:szCs w:val="24"/>
+                <w14:ligatures w14:val="none"/>
+              </w:rPr>
+              <w:t xml:space="preserve">Khi PAKN cần chuyển xử lý, trường hợp nào thường xảy ra? </w:t>
             </w:r>
             <w:r>
               <w:rPr>
@@ -26085,8 +26189,7 @@
                 <w:szCs w:val="24"/>
                 <w14:ligatures w14:val="none"/>
               </w:rPr>
-              <w:lastRenderedPageBreak/>
-              <w:t>C. Cả nội dung và thẩm quyền; D. Yếu tố khác.</w:t>
+              <w:t>A. Chuyển đến đơn vị chuyên môn; B. Chuyển đến đơn vị có thẩm quyền; C. Chuyển đến đơn vị khác; D. Không chuyển và xử lý trực tiếp.</w:t>
             </w:r>
           </w:p>
         </w:tc>
@@ -26113,8 +26216,7 @@
                 <w:szCs w:val="24"/>
                 <w14:ligatures w14:val="none"/>
               </w:rPr>
-              <w:lastRenderedPageBreak/>
-              <w:t>Cán bộ tiếp nhận PAKN</w:t>
+              <w:t>Cán bộ Cổng Dịch vụ công</w:t>
             </w:r>
           </w:p>
         </w:tc>
@@ -26141,7 +26243,7 @@
                 <w:szCs w:val="24"/>
                 <w14:ligatures w14:val="none"/>
               </w:rPr>
-              <w:t>Xác định căn cứ thực tế được sử dụng để phân loại và xác định hướng xử lý PAKN.</w:t>
+              <w:t>Kiểm chứng các hướng xử lý sau Gateway “Có chuyển xử lý không?” và “Chuyển xử lý đến đơn vị nào?”.</w:t>
             </w:r>
           </w:p>
         </w:tc>
@@ -26171,7 +26273,7 @@
                 <w:szCs w:val="24"/>
                 <w14:ligatures w14:val="none"/>
               </w:rPr>
-              <w:t>2</w:t>
+              <w:t>3</w:t>
             </w:r>
           </w:p>
         </w:tc>
@@ -26225,7 +26327,7 @@
                 <w:szCs w:val="24"/>
                 <w14:ligatures w14:val="none"/>
               </w:rPr>
-              <w:t xml:space="preserve">Khi PAKN cần chuyển xử lý, trường hợp nào thường xảy ra? </w:t>
+              <w:t xml:space="preserve">Khi xem xét PAKN, nếu nội dung không thuộc thẩm quyền của đơn vị thì cán bộ thường thực hiện như thế nào? </w:t>
             </w:r>
             <w:r>
               <w:rPr>
@@ -26237,7 +26339,7 @@
                 <w:szCs w:val="24"/>
                 <w14:ligatures w14:val="none"/>
               </w:rPr>
-              <w:t>A. Chuyển đến đơn vị chuyên môn; B. Chuyển đến đơn vị có thẩm quyền; C. Chuyển đến đơn vị khác; D. Không chuyển và xử lý trực tiếp.</w:t>
+              <w:t>A. Chuyển đến đơn vị có thẩm quyền; B. Trả lại người gửi; C. Tiếp tục tự xử lý; D. Hướng dẫn người gửi gửi lại.</w:t>
             </w:r>
           </w:p>
         </w:tc>
@@ -26264,7 +26366,7 @@
                 <w:szCs w:val="24"/>
                 <w14:ligatures w14:val="none"/>
               </w:rPr>
-              <w:t>Cán bộ Cổng Dịch vụ công</w:t>
+              <w:t>Cán bộ cơ quan tiếp nhận và xử lý</w:t>
             </w:r>
           </w:p>
         </w:tc>
@@ -26291,7 +26393,7 @@
                 <w:szCs w:val="24"/>
                 <w14:ligatures w14:val="none"/>
               </w:rPr>
-              <w:t>Kiểm chứng các hướng xử lý sau Gateway “Có chuyển xử lý không?” và “Chuyển xử lý đến đơn vị nào?”.</w:t>
+              <w:t>Kiểm chứng nhánh xử lý khi PAKN không thuộc thẩm quyền của đơn vị.</w:t>
             </w:r>
           </w:p>
         </w:tc>
@@ -26321,7 +26423,7 @@
                 <w:szCs w:val="24"/>
                 <w14:ligatures w14:val="none"/>
               </w:rPr>
-              <w:t>3</w:t>
+              <w:t>4</w:t>
             </w:r>
           </w:p>
         </w:tc>
@@ -26375,7 +26477,7 @@
                 <w:szCs w:val="24"/>
                 <w14:ligatures w14:val="none"/>
               </w:rPr>
-              <w:t xml:space="preserve">Khi xem xét PAKN, nếu nội dung không thuộc thẩm quyền của đơn vị thì cán bộ thường thực hiện như thế nào? </w:t>
+              <w:t xml:space="preserve">Khi xử lý PAKN, trường hợp nào dẫn đến việc cần xác minh, thu thập thông tin bổ sung? </w:t>
             </w:r>
             <w:r>
               <w:rPr>
@@ -26387,7 +26489,7 @@
                 <w:szCs w:val="24"/>
                 <w14:ligatures w14:val="none"/>
               </w:rPr>
-              <w:t>A. Chuyển đến đơn vị có thẩm quyền; B. Trả lại người gửi; C. Tiếp tục tự xử lý; D. Hướng dẫn người gửi gửi lại.</w:t>
+              <w:t>A. Nội dung chưa đủ thông tin; B. Cần làm rõ nội dung phản ánh; C. Cần thêm căn cứ để giải quyết; D. Các trường hợp khác.</w:t>
             </w:r>
           </w:p>
         </w:tc>
@@ -26441,7 +26543,7 @@
                 <w:szCs w:val="24"/>
                 <w14:ligatures w14:val="none"/>
               </w:rPr>
-              <w:t>Kiểm chứng nhánh xử lý khi PAKN không thuộc thẩm quyền của đơn vị.</w:t>
+              <w:t>Xác định điều kiện thực tế dẫn đến Gateway “Có cần xác minh bổ sung không?”.</w:t>
             </w:r>
           </w:p>
         </w:tc>
@@ -26471,7 +26573,7 @@
                 <w:szCs w:val="24"/>
                 <w14:ligatures w14:val="none"/>
               </w:rPr>
-              <w:t>4</w:t>
+              <w:t>5</w:t>
             </w:r>
           </w:p>
         </w:tc>
@@ -26525,7 +26627,7 @@
                 <w:szCs w:val="24"/>
                 <w14:ligatures w14:val="none"/>
               </w:rPr>
-              <w:t xml:space="preserve">Khi xử lý PAKN, trường hợp nào dẫn đến việc cần xác minh, thu thập thông tin bổ sung? </w:t>
+              <w:t xml:space="preserve">Sau khi nhận kết quả giải quyết PAKN, nếu người gửi không đồng ý thì thông thường họ sẽ thực hiện bước nào? </w:t>
             </w:r>
             <w:r>
               <w:rPr>
@@ -26537,7 +26639,7 @@
                 <w:szCs w:val="24"/>
                 <w14:ligatures w14:val="none"/>
               </w:rPr>
-              <w:t>A. Nội dung chưa đủ thông tin; B. Cần làm rõ nội dung phản ánh; C. Cần thêm căn cứ để giải quyết; D. Các trường hợp khác.</w:t>
+              <w:t>A. Gửi khiếu nại lại; B. Yêu cầu bổ sung thông tin; C. Kết thúc hồ sơ; D. Thực hiện theo hướng dẫn khác.</w:t>
             </w:r>
           </w:p>
         </w:tc>
@@ -26564,7 +26666,7 @@
                 <w:szCs w:val="24"/>
                 <w14:ligatures w14:val="none"/>
               </w:rPr>
-              <w:t>Cán bộ cơ quan tiếp nhận và xử lý</w:t>
+              <w:t>Người dân / Tổ chức</w:t>
             </w:r>
           </w:p>
         </w:tc>
@@ -26591,7 +26693,7 @@
                 <w:szCs w:val="24"/>
                 <w14:ligatures w14:val="none"/>
               </w:rPr>
-              <w:t>Xác định điều kiện thực tế dẫn đến Gateway “Có cần xác minh bổ sung không?”.</w:t>
+              <w:t>Kiểm chứng nhánh khiếu nại lại và vòng lặp quay về bước tiếp nhận hồ sơ PAKN.</w:t>
             </w:r>
           </w:p>
         </w:tc>
@@ -26621,7 +26723,7 @@
                 <w:szCs w:val="24"/>
                 <w14:ligatures w14:val="none"/>
               </w:rPr>
-              <w:t>5</w:t>
+              <w:t>6</w:t>
             </w:r>
           </w:p>
         </w:tc>
@@ -26648,7 +26750,7 @@
                 <w:szCs w:val="24"/>
                 <w14:ligatures w14:val="none"/>
               </w:rPr>
-              <w:t>Có cấu trúc</w:t>
+              <w:t>Không có cấu trúc</w:t>
             </w:r>
           </w:p>
         </w:tc>
@@ -26675,19 +26777,7 @@
                 <w:szCs w:val="24"/>
                 <w14:ligatures w14:val="none"/>
               </w:rPr>
-              <w:t xml:space="preserve">Sau khi nhận kết quả giải quyết PAKN, nếu người gửi không đồng ý thì thông thường họ sẽ thực hiện bước nào? </w:t>
-            </w:r>
-            <w:r>
-              <w:rPr>
-                <w:rFonts w:eastAsia="Times New Roman" w:cs="Times New Roman"/>
-                <w:b/>
-                <w:bCs/>
-                <w:kern w:val="0"/>
-                <w:sz w:val="24"/>
-                <w:szCs w:val="24"/>
-                <w14:ligatures w14:val="none"/>
-              </w:rPr>
-              <w:t>A. Gửi khiếu nại lại; B. Yêu cầu bổ sung thông tin; C. Kết thúc hồ sơ; D. Thực hiện theo hướng dẫn khác.</w:t>
+              <w:t>Anh/chị có thể mô tả cụ thể cách một PAKN được tiếp nhận và phân loại từ khi người dân gửi đến khi xác định hướng xử lý không?</w:t>
             </w:r>
           </w:p>
         </w:tc>
@@ -26714,7 +26804,7 @@
                 <w:szCs w:val="24"/>
                 <w14:ligatures w14:val="none"/>
               </w:rPr>
-              <w:t>Người dân / Tổ chức</w:t>
+              <w:t>Cán bộ tiếp nhận PAKN</w:t>
             </w:r>
           </w:p>
         </w:tc>
@@ -26741,7 +26831,7 @@
                 <w:szCs w:val="24"/>
                 <w14:ligatures w14:val="none"/>
               </w:rPr>
-              <w:t>Kiểm chứng nhánh khiếu nại lại và vòng lặp quay về bước tiếp nhận hồ sơ PAKN.</w:t>
+              <w:t>Tìm hiểu quy trình thực tế của hoạt động tiếp nhận và phân loại, đồng thời phát hiện các bước chưa được thể hiện trong BPMN.</w:t>
             </w:r>
           </w:p>
         </w:tc>
@@ -26771,7 +26861,7 @@
                 <w:szCs w:val="24"/>
                 <w14:ligatures w14:val="none"/>
               </w:rPr>
-              <w:t>6</w:t>
+              <w:t>7</w:t>
             </w:r>
           </w:p>
         </w:tc>
@@ -26825,7 +26915,7 @@
                 <w:szCs w:val="24"/>
                 <w14:ligatures w14:val="none"/>
               </w:rPr>
-              <w:t>Anh/chị có thể mô tả cụ thể cách một PAKN được tiếp nhận và phân loại từ khi người dân gửi đến khi xác định hướng xử lý không?</w:t>
+              <w:t>Trong quá trình chuyển PAKN đến đơn vị khác, anh/chị thường thực hiện những công việc gì và thường gặp khó khăn nào?</w:t>
             </w:r>
           </w:p>
         </w:tc>
@@ -26852,7 +26942,7 @@
                 <w:szCs w:val="24"/>
                 <w14:ligatures w14:val="none"/>
               </w:rPr>
-              <w:t>Cán bộ tiếp nhận PAKN</w:t>
+              <w:t>Cán bộ Cổng Dịch vụ công / Cán bộ xử lý PAKN</w:t>
             </w:r>
           </w:p>
         </w:tc>
@@ -26879,7 +26969,7 @@
                 <w:szCs w:val="24"/>
                 <w14:ligatures w14:val="none"/>
               </w:rPr>
-              <w:t>Tìm hiểu quy trình thực tế của hoạt động tiếp nhận và phân loại, đồng thời phát hiện các bước chưa được thể hiện trong BPMN.</w:t>
+              <w:t>Làm rõ cách thức chuyển PAKN và xác định các vấn đề phát sinh trong quá trình chuyển xử lý.</w:t>
             </w:r>
           </w:p>
         </w:tc>
@@ -26909,7 +26999,7 @@
                 <w:szCs w:val="24"/>
                 <w14:ligatures w14:val="none"/>
               </w:rPr>
-              <w:t>7</w:t>
+              <w:t>8</w:t>
             </w:r>
           </w:p>
         </w:tc>
@@ -26963,7 +27053,7 @@
                 <w:szCs w:val="24"/>
                 <w14:ligatures w14:val="none"/>
               </w:rPr>
-              <w:t>Trong quá trình chuyển PAKN đến đơn vị khác, anh/chị thường thực hiện những công việc gì và thường gặp khó khăn nào?</w:t>
+              <w:t>Anh/chị hãy mô tả quá trình xem xét và xác minh nội dung PAKN trước khi đưa ra quyết định giải quyết theo thẩm quyền.</w:t>
             </w:r>
           </w:p>
         </w:tc>
@@ -26990,7 +27080,7 @@
                 <w:szCs w:val="24"/>
                 <w14:ligatures w14:val="none"/>
               </w:rPr>
-              <w:t>Cán bộ Cổng Dịch vụ công / Cán bộ xử lý PAKN</w:t>
+              <w:t>Cán bộ cơ quan tiếp nhận và xử lý</w:t>
             </w:r>
           </w:p>
         </w:tc>
@@ -27017,7 +27107,7 @@
                 <w:szCs w:val="24"/>
                 <w14:ligatures w14:val="none"/>
               </w:rPr>
-              <w:t>Làm rõ cách thức chuyển PAKN và xác định các vấn đề phát sinh trong quá trình chuyển xử lý.</w:t>
+              <w:t>Làm rõ các hoạt động thực tế bên trong bước “Xem xét, xác minh nội dung PAKN”.</w:t>
             </w:r>
           </w:p>
         </w:tc>
@@ -27047,7 +27137,7 @@
                 <w:szCs w:val="24"/>
                 <w14:ligatures w14:val="none"/>
               </w:rPr>
-              <w:t>8</w:t>
+              <w:t>9</w:t>
             </w:r>
           </w:p>
         </w:tc>
@@ -27101,7 +27191,7 @@
                 <w:szCs w:val="24"/>
                 <w14:ligatures w14:val="none"/>
               </w:rPr>
-              <w:t>Anh/chị hãy mô tả quá trình xem xét và xác minh nội dung PAKN trước khi đưa ra quyết định giải quyết theo thẩm quyền.</w:t>
+              <w:t>Khi cần xác minh hoặc thu thập thêm thông tin, anh/chị thường thực hiện như thế nào để có đủ cơ sở giải quyết PAKN?</w:t>
             </w:r>
           </w:p>
         </w:tc>
@@ -27155,7 +27245,7 @@
                 <w:szCs w:val="24"/>
                 <w14:ligatures w14:val="none"/>
               </w:rPr>
-              <w:t>Làm rõ các hoạt động thực tế bên trong bước “Xem xét, xác minh nội dung PAKN”.</w:t>
+              <w:t>Tìm hiểu cách thực hiện xác minh bổ sung và các bước thực tế có thể chưa được thể hiện trong mô hình.</w:t>
             </w:r>
           </w:p>
         </w:tc>
@@ -27185,145 +27275,6 @@
                 <w:szCs w:val="24"/>
                 <w14:ligatures w14:val="none"/>
               </w:rPr>
-              <w:t>9</w:t>
-            </w:r>
-          </w:p>
-        </w:tc>
-        <w:tc>
-          <w:tcPr>
-            <w:tcW w:w="1580" w:type="dxa"/>
-            <w:hideMark/>
-          </w:tcPr>
-          <w:p>
-            <w:pPr>
-              <w:rPr>
-                <w:rFonts w:eastAsia="Times New Roman" w:cs="Times New Roman"/>
-                <w:kern w:val="0"/>
-                <w:sz w:val="24"/>
-                <w:szCs w:val="24"/>
-                <w14:ligatures w14:val="none"/>
-              </w:rPr>
-            </w:pPr>
-            <w:r>
-              <w:rPr>
-                <w:rFonts w:eastAsia="Times New Roman" w:cs="Times New Roman"/>
-                <w:kern w:val="0"/>
-                <w:sz w:val="24"/>
-                <w:szCs w:val="24"/>
-                <w14:ligatures w14:val="none"/>
-              </w:rPr>
-              <w:t>Không có cấu trúc</w:t>
-            </w:r>
-          </w:p>
-        </w:tc>
-        <w:tc>
-          <w:tcPr>
-            <w:tcW w:w="3720" w:type="dxa"/>
-            <w:hideMark/>
-          </w:tcPr>
-          <w:p>
-            <w:pPr>
-              <w:rPr>
-                <w:rFonts w:eastAsia="Times New Roman" w:cs="Times New Roman"/>
-                <w:kern w:val="0"/>
-                <w:sz w:val="24"/>
-                <w:szCs w:val="24"/>
-                <w14:ligatures w14:val="none"/>
-              </w:rPr>
-            </w:pPr>
-            <w:r>
-              <w:rPr>
-                <w:rFonts w:eastAsia="Times New Roman" w:cs="Times New Roman"/>
-                <w:kern w:val="0"/>
-                <w:sz w:val="24"/>
-                <w:szCs w:val="24"/>
-                <w14:ligatures w14:val="none"/>
-              </w:rPr>
-              <w:t>Khi cần xác minh hoặc thu thập thêm thông tin, anh/chị thường thực hiện như thế nào để có đủ cơ sở giải quyết PAKN?</w:t>
-            </w:r>
-          </w:p>
-        </w:tc>
-        <w:tc>
-          <w:tcPr>
-            <w:tcW w:w="0" w:type="auto"/>
-            <w:hideMark/>
-          </w:tcPr>
-          <w:p>
-            <w:pPr>
-              <w:rPr>
-                <w:rFonts w:eastAsia="Times New Roman" w:cs="Times New Roman"/>
-                <w:kern w:val="0"/>
-                <w:sz w:val="24"/>
-                <w:szCs w:val="24"/>
-                <w14:ligatures w14:val="none"/>
-              </w:rPr>
-            </w:pPr>
-            <w:r>
-              <w:rPr>
-                <w:rFonts w:eastAsia="Times New Roman" w:cs="Times New Roman"/>
-                <w:kern w:val="0"/>
-                <w:sz w:val="24"/>
-                <w:szCs w:val="24"/>
-                <w14:ligatures w14:val="none"/>
-              </w:rPr>
-              <w:t>Cán bộ cơ quan tiếp nhận và xử lý</w:t>
-            </w:r>
-          </w:p>
-        </w:tc>
-        <w:tc>
-          <w:tcPr>
-            <w:tcW w:w="2493" w:type="dxa"/>
-            <w:hideMark/>
-          </w:tcPr>
-          <w:p>
-            <w:pPr>
-              <w:rPr>
-                <w:rFonts w:eastAsia="Times New Roman" w:cs="Times New Roman"/>
-                <w:kern w:val="0"/>
-                <w:sz w:val="24"/>
-                <w:szCs w:val="24"/>
-                <w14:ligatures w14:val="none"/>
-              </w:rPr>
-            </w:pPr>
-            <w:r>
-              <w:rPr>
-                <w:rFonts w:eastAsia="Times New Roman" w:cs="Times New Roman"/>
-                <w:kern w:val="0"/>
-                <w:sz w:val="24"/>
-                <w:szCs w:val="24"/>
-                <w14:ligatures w14:val="none"/>
-              </w:rPr>
-              <w:t>Tìm hiểu cách thực hiện xác minh bổ sung và các bước thực tế có thể chưa được thể hiện trong mô hình.</w:t>
-            </w:r>
-          </w:p>
-        </w:tc>
-      </w:tr>
-      <w:tr>
-        <w:tc>
-          <w:tcPr>
-            <w:tcW w:w="670" w:type="dxa"/>
-            <w:hideMark/>
-          </w:tcPr>
-          <w:p>
-            <w:pPr>
-              <w:jc w:val="right"/>
-              <w:rPr>
-                <w:rFonts w:eastAsia="Times New Roman" w:cs="Times New Roman"/>
-                <w:kern w:val="0"/>
-                <w:sz w:val="24"/>
-                <w:szCs w:val="24"/>
-                <w14:ligatures w14:val="none"/>
-              </w:rPr>
-            </w:pPr>
-            <w:r>
-              <w:rPr>
-                <w:rFonts w:eastAsia="Times New Roman" w:cs="Times New Roman"/>
-                <w:kern w:val="0"/>
-                <w:sz w:val="24"/>
-                <w:szCs w:val="24"/>
-                <w14:ligatures w14:val="none"/>
-              </w:rPr>
-              <w:lastRenderedPageBreak/>
               <w:t>10</w:t>
             </w:r>
           </w:p>
@@ -27517,13 +27468,7 @@
         <w:rPr>
           <w:lang w:val="vi-VN"/>
         </w:rPr>
-        <w:t xml:space="preserve">2.4.1.3 Câu hỏi định </w:t>
-      </w:r>
-      <w:r>
-        <w:rPr>
-          <w:lang w:val="vi-VN"/>
-        </w:rPr>
-        <w:t>lượng</w:t>
+        <w:t>2.4.1.3 Câu hỏi định lượng</w:t>
       </w:r>
     </w:p>
     <w:tbl>
@@ -28891,7 +28836,6 @@
                 <w:szCs w:val="24"/>
                 <w14:ligatures w14:val="none"/>
               </w:rPr>
-              <w:lastRenderedPageBreak/>
               <w:t>9</w:t>
             </w:r>
           </w:p>
@@ -29217,11 +29161,20 @@
     <w:p>
       <w:pPr>
         <w:pStyle w:val="Heading5"/>
-      </w:pPr>
-      <w:r>
+        <w:rPr>
+          <w:lang w:val="vi-VN"/>
+        </w:rPr>
+      </w:pPr>
+      <w:r>
+        <w:rPr>
+          <w:lang w:val="vi-VN"/>
+        </w:rPr>
         <w:t>2.4.2 Mô hì</w:t>
       </w:r>
       <w:r>
+        <w:rPr>
+          <w:lang w:val="vi-VN"/>
+        </w:rPr>
         <w:t>nh hóa quy trình thanh toán trực tuyến</w:t>
       </w:r>
     </w:p>
@@ -29945,7 +29898,6 @@
                 <w:sz w:val="24"/>
                 <w:szCs w:val="24"/>
               </w:rPr>
-              <w:lastRenderedPageBreak/>
               <w:t>6</w:t>
             </w:r>
           </w:p>
@@ -31240,7 +31192,6 @@
           <w:sz w:val="24"/>
           <w:szCs w:val="24"/>
         </w:rPr>
-        <w:lastRenderedPageBreak/>
         <w:t>Người dân hoặc tổ chức: khởi tạo yêu cầu thanh toán, kiểm tra số tiền phải nộp, lựa chọn phương thức thanh toán, thực hiện xác thực và xác nhận giao dịch. khi giao dịch thất bại, người dân hoặc tổ chức có thể lựa chọn thực hiện lại hoặc ngưng giao dịch.</w:t>
       </w:r>
     </w:p>
@@ -31554,7 +31505,6 @@
         <w:jc w:val="both"/>
       </w:pPr>
       <w:r>
-        <w:lastRenderedPageBreak/>
         <w:t>Sau khi lựa chọn phương thức, người dùng thực hiện xác thực giao dịch theo yêu cầu của ngân hàng hoặc tổ chức cung ứng dịch vụ thanh toán. Phương thức xác thực có thể bao gồm OTP, Smart OTP, sinh trắc học hoặc phương thức xác thực khác. Nếu thông tin xác thực không hợp lệ hoặc người dùng không xác nhận giao dịch, hệ thống thông báo lỗi và cho phép người dùng thực hiện lại hoặc kết thúc giao dịch.</w:t>
       </w:r>
     </w:p>
@@ -31842,7 +31792,6 @@
           <w:sz w:val="24"/>
           <w:szCs w:val="24"/>
         </w:rPr>
-        <w:lastRenderedPageBreak/>
         <w:t xml:space="preserve">Kiểm tra thông tin tài khoản; </w:t>
       </w:r>
     </w:p>
@@ -32395,7 +32344,6 @@
           <w:sz w:val="24"/>
           <w:szCs w:val="24"/>
         </w:rPr>
-        <w:lastRenderedPageBreak/>
         <w:t>Bước 10. Phát hành biên lai</w:t>
       </w:r>
     </w:p>
@@ -33027,7 +32975,6 @@
           <w:rFonts w:eastAsiaTheme="majorEastAsia"/>
           <w:b w:val="0"/>
         </w:rPr>
-        <w:lastRenderedPageBreak/>
         <w:t>Trường hợp lựa chọn thực hiện lại:</w:t>
       </w:r>
       <w:r>
@@ -33566,7 +33513,6 @@
           <w:sz w:val="24"/>
           <w:szCs w:val="24"/>
         </w:rPr>
-        <w:lastRenderedPageBreak/>
         <w:t>Xử lý hoàn trả giao dịch</w:t>
       </w:r>
     </w:p>
@@ -33912,7 +33858,6 @@
       <w:bookmarkStart w:id="53" w:name="_Toc236264134"/>
       <w:bookmarkStart w:id="54" w:name="_Toc236682222"/>
       <w:r>
-        <w:lastRenderedPageBreak/>
         <w:t>NGUỒN THAM KHẢO</w:t>
       </w:r>
       <w:bookmarkEnd w:id="53"/>
@@ -34077,7 +34022,7 @@
 </file>
 
 <file path=word/endnotes.xml><?xml version="1.0" encoding="utf-8"?>
-<w:endnotes xmlns:wpc="http://schemas.microsoft.com/office/word/2010/wordprocessingCanvas" xmlns:cx="http://schemas.microsoft.com/office/drawing/2014/chartex" xmlns:cx1="http://schemas.microsoft.com/office/drawing/2015/9/8/chartex" xmlns:cx2="http://schemas.microsoft.com/office/drawing/2015/10/21/chartex" xmlns:cx3="http://schemas.microsoft.com/office/drawing/2016/5/9/chartex" xmlns:cx4="http://schemas.microsoft.com/office/drawing/2016/5/10/chartex" xmlns:cx5="http://schemas.microsoft.com/office/drawing/2016/5/11/chartex" xmlns:cx6="http://schemas.microsoft.com/office/drawing/2016/5/12/chartex" xmlns:cx7="http://schemas.microsoft.com/office/drawing/2016/5/13/chartex" xmlns:cx8="http://schemas.microsoft.com/office/drawing/2016/5/14/chartex" xmlns:mc="http://schemas.openxmlformats.org/markup-compatibility/2006" xmlns:aink="http://schemas.microsoft.com/office/drawing/2016/ink" xmlns:am3d="http://schemas.microsoft.com/office/drawing/2017/model3d" xmlns:o="urn:schemas-microsoft-com:office:office" xmlns:oel="http://schemas.microsoft.com/office/2019/extlst" xmlns:r="http://schemas.openxmlformats.org/officeDocument/2006/relationships" xmlns:m="http://schemas.openxmlformats.org/officeDocument/2006/math" xmlns:v="urn:schemas-microsoft-com:vml" xmlns:wp14="http://schemas.microsoft.com/office/word/2010/wordprocessingDrawing" xmlns:wp="http://schemas.openxmlformats.org/drawingml/2006/wordprocessingDrawing" xmlns:w10="urn:schemas-microsoft-com:office:word" xmlns:w="http://schemas.openxmlformats.org/wordprocessingml/2006/main" xmlns:w14="http://schemas.microsoft.com/office/word/2010/wordml" xmlns:w15="http://schemas.microsoft.com/office/word/2012/wordml" xmlns:w16cei="http://schemas.microsoft.com/office/word/2026/wordml/cei" xmlns:w16cex="http://schemas.microsoft.com/office/word/2018/wordml/cex" xmlns:w16cid="http://schemas.microsoft.com/office/word/2016/wordml/cid" xmlns:w16="http://schemas.microsoft.com/office/word/2018/wordml" xmlns:w16du="http://schemas.microsoft.com/office/word/2023/wordml/word16du" xmlns:w16sdtdh="http://schemas.microsoft.com/office/word/2020/wordml/sdtdatahash" xmlns:w16sdtfl="http://schemas.microsoft.com/office/word/2024/wordml/sdtformatlock" xmlns:w16se="http://schemas.microsoft.com/office/word/2015/wordml/symex" xmlns:wpg="http://schemas.microsoft.com/office/word/2010/wordprocessingGroup" xmlns:wpi="http://schemas.microsoft.com/office/word/2010/wordprocessingInk" xmlns:wne="http://schemas.microsoft.com/office/word/2006/wordml" xmlns:wps="http://schemas.microsoft.com/office/word/2010/wordprocessingShape" mc:Ignorable="w14 w15 w16se w16cid w16 w16cex w16sdtdh w16sdtfl w16du wp14">
+<w:endnotes xmlns:wpc="http://schemas.microsoft.com/office/word/2010/wordprocessingCanvas" xmlns:cx="http://schemas.microsoft.com/office/drawing/2014/chartex" xmlns:cx1="http://schemas.microsoft.com/office/drawing/2015/9/8/chartex" xmlns:cx2="http://schemas.microsoft.com/office/drawing/2015/10/21/chartex" xmlns:cx3="http://schemas.microsoft.com/office/drawing/2016/5/9/chartex" xmlns:cx4="http://schemas.microsoft.com/office/drawing/2016/5/10/chartex" xmlns:cx5="http://schemas.microsoft.com/office/drawing/2016/5/11/chartex" xmlns:cx6="http://schemas.microsoft.com/office/drawing/2016/5/12/chartex" xmlns:cx7="http://schemas.microsoft.com/office/drawing/2016/5/13/chartex" xmlns:cx8="http://schemas.microsoft.com/office/drawing/2016/5/14/chartex" xmlns:mc="http://schemas.openxmlformats.org/markup-compatibility/2006" xmlns:aink="http://schemas.microsoft.com/office/drawing/2016/ink" xmlns:am3d="http://schemas.microsoft.com/office/drawing/2017/model3d" xmlns:o="urn:schemas-microsoft-com:office:office" xmlns:oel="http://schemas.microsoft.com/office/2019/extlst" xmlns:r="http://schemas.openxmlformats.org/officeDocument/2006/relationships" xmlns:m="http://schemas.openxmlformats.org/officeDocument/2006/math" xmlns:v="urn:schemas-microsoft-com:vml" xmlns:wp14="http://schemas.microsoft.com/office/word/2010/wordprocessingDrawing" xmlns:wp="http://schemas.openxmlformats.org/drawingml/2006/wordprocessingDrawing" xmlns:w10="urn:schemas-microsoft-com:office:word" xmlns:w="http://schemas.openxmlformats.org/wordprocessingml/2006/main" xmlns:w14="http://schemas.microsoft.com/office/word/2010/wordml" xmlns:w15="http://schemas.microsoft.com/office/word/2012/wordml" xmlns:w16cex="http://schemas.microsoft.com/office/word/2018/wordml/cex" xmlns:w16cid="http://schemas.microsoft.com/office/word/2016/wordml/cid" xmlns:w16="http://schemas.microsoft.com/office/word/2018/wordml" xmlns:w16du="http://schemas.microsoft.com/office/word/2023/wordml/word16du" xmlns:w16sdtdh="http://schemas.microsoft.com/office/word/2020/wordml/sdtdatahash" xmlns:w16sdtfl="http://schemas.microsoft.com/office/word/2024/wordml/sdtformatlock" xmlns:w16se="http://schemas.microsoft.com/office/word/2015/wordml/symex" xmlns:wpg="http://schemas.microsoft.com/office/word/2010/wordprocessingGroup" xmlns:wpi="http://schemas.microsoft.com/office/word/2010/wordprocessingInk" xmlns:wne="http://schemas.microsoft.com/office/word/2006/wordml" xmlns:wps="http://schemas.microsoft.com/office/word/2010/wordprocessingShape" mc:Ignorable="w14 w15 w16se w16cid w16 w16cex w16sdtdh w16sdtfl w16du wp14">
   <w:endnote w:type="separator" w:id="-1">
     <w:p>
       <w:pPr>
@@ -34102,7 +34047,7 @@
 </file>
 
 <file path=word/footer1.xml><?xml version="1.0" encoding="utf-8"?>
-<w:ftr xmlns:wpc="http://schemas.microsoft.com/office/word/2010/wordprocessingCanvas" xmlns:cx="http://schemas.microsoft.com/office/drawing/2014/chartex" xmlns:cx1="http://schemas.microsoft.com/office/drawing/2015/9/8/chartex" xmlns:cx2="http://schemas.microsoft.com/office/drawing/2015/10/21/chartex" xmlns:cx3="http://schemas.microsoft.com/office/drawing/2016/5/9/chartex" xmlns:cx4="http://schemas.microsoft.com/office/drawing/2016/5/10/chartex" xmlns:cx5="http://schemas.microsoft.com/office/drawing/2016/5/11/chartex" xmlns:cx6="http://schemas.microsoft.com/office/drawing/2016/5/12/chartex" xmlns:cx7="http://schemas.microsoft.com/office/drawing/2016/5/13/chartex" xmlns:cx8="http://schemas.microsoft.com/office/drawing/2016/5/14/chartex" xmlns:mc="http://schemas.openxmlformats.org/markup-compatibility/2006" xmlns:aink="http://schemas.microsoft.com/office/drawing/2016/ink" xmlns:am3d="http://schemas.microsoft.com/office/drawing/2017/model3d" xmlns:o="urn:schemas-microsoft-com:office:office" xmlns:oel="http://schemas.microsoft.com/office/2019/extlst" xmlns:r="http://schemas.openxmlformats.org/officeDocument/2006/relationships" xmlns:m="http://schemas.openxmlformats.org/officeDocument/2006/math" xmlns:v="urn:schemas-microsoft-com:vml" xmlns:wp14="http://schemas.microsoft.com/office/word/2010/wordprocessingDrawing" xmlns:wp="http://schemas.openxmlformats.org/drawingml/2006/wordprocessingDrawing" xmlns:w10="urn:schemas-microsoft-com:office:word" xmlns:w="http://schemas.openxmlformats.org/wordprocessingml/2006/main" xmlns:w14="http://schemas.microsoft.com/office/word/2010/wordml" xmlns:w15="http://schemas.microsoft.com/office/word/2012/wordml" xmlns:w16cei="http://schemas.microsoft.com/office/word/2026/wordml/cei" xmlns:w16cex="http://schemas.microsoft.com/office/word/2018/wordml/cex" xmlns:w16cid="http://schemas.microsoft.com/office/word/2016/wordml/cid" xmlns:w16="http://schemas.microsoft.com/office/word/2018/wordml" xmlns:w16du="http://schemas.microsoft.com/office/word/2023/wordml/word16du" xmlns:w16sdtdh="http://schemas.microsoft.com/office/word/2020/wordml/sdtdatahash" xmlns:w16sdtfl="http://schemas.microsoft.com/office/word/2024/wordml/sdtformatlock" xmlns:w16se="http://schemas.microsoft.com/office/word/2015/wordml/symex" xmlns:wpg="http://schemas.microsoft.com/office/word/2010/wordprocessingGroup" xmlns:wpi="http://schemas.microsoft.com/office/word/2010/wordprocessingInk" xmlns:wne="http://schemas.microsoft.com/office/word/2006/wordml" xmlns:wps="http://schemas.microsoft.com/office/word/2010/wordprocessingShape" mc:Ignorable="w14 w15 w16se w16cid w16 w16cex w16sdtdh w16sdtfl w16du wp14">
+<w:ftr xmlns:wpc="http://schemas.microsoft.com/office/word/2010/wordprocessingCanvas" xmlns:cx="http://schemas.microsoft.com/office/drawing/2014/chartex" xmlns:cx1="http://schemas.microsoft.com/office/drawing/2015/9/8/chartex" xmlns:cx2="http://schemas.microsoft.com/office/drawing/2015/10/21/chartex" xmlns:cx3="http://schemas.microsoft.com/office/drawing/2016/5/9/chartex" xmlns:cx4="http://schemas.microsoft.com/office/drawing/2016/5/10/chartex" xmlns:cx5="http://schemas.microsoft.com/office/drawing/2016/5/11/chartex" xmlns:cx6="http://schemas.microsoft.com/office/drawing/2016/5/12/chartex" xmlns:cx7="http://schemas.microsoft.com/office/drawing/2016/5/13/chartex" xmlns:cx8="http://schemas.microsoft.com/office/drawing/2016/5/14/chartex" xmlns:mc="http://schemas.openxmlformats.org/markup-compatibility/2006" xmlns:aink="http://schemas.microsoft.com/office/drawing/2016/ink" xmlns:am3d="http://schemas.microsoft.com/office/drawing/2017/model3d" xmlns:o="urn:schemas-microsoft-com:office:office" xmlns:oel="http://schemas.microsoft.com/office/2019/extlst" xmlns:r="http://schemas.openxmlformats.org/officeDocument/2006/relationships" xmlns:m="http://schemas.openxmlformats.org/officeDocument/2006/math" xmlns:v="urn:schemas-microsoft-com:vml" xmlns:wp14="http://schemas.microsoft.com/office/word/2010/wordprocessingDrawing" xmlns:wp="http://schemas.openxmlformats.org/drawingml/2006/wordprocessingDrawing" xmlns:w10="urn:schemas-microsoft-com:office:word" xmlns:w="http://schemas.openxmlformats.org/wordprocessingml/2006/main" xmlns:w14="http://schemas.microsoft.com/office/word/2010/wordml" xmlns:w15="http://schemas.microsoft.com/office/word/2012/wordml" xmlns:w16cex="http://schemas.microsoft.com/office/word/2018/wordml/cex" xmlns:w16cid="http://schemas.microsoft.com/office/word/2016/wordml/cid" xmlns:w16="http://schemas.microsoft.com/office/word/2018/wordml" xmlns:w16du="http://schemas.microsoft.com/office/word/2023/wordml/word16du" xmlns:w16sdtdh="http://schemas.microsoft.com/office/word/2020/wordml/sdtdatahash" xmlns:w16sdtfl="http://schemas.microsoft.com/office/word/2024/wordml/sdtformatlock" xmlns:w16se="http://schemas.microsoft.com/office/word/2015/wordml/symex" xmlns:wpg="http://schemas.microsoft.com/office/word/2010/wordprocessingGroup" xmlns:wpi="http://schemas.microsoft.com/office/word/2010/wordprocessingInk" xmlns:wne="http://schemas.microsoft.com/office/word/2006/wordml" xmlns:wps="http://schemas.microsoft.com/office/word/2010/wordprocessingShape" mc:Ignorable="w14 w15 w16se w16cid w16 w16cex w16sdtdh w16sdtfl w16du wp14">
   <w:sdt>
     <w:sdtPr>
       <w:id w:val="365795399"/>
@@ -34170,7 +34115,7 @@
 </file>
 
 <file path=word/footnotes.xml><?xml version="1.0" encoding="utf-8"?>
-<w:footnotes xmlns:wpc="http://schemas.microsoft.com/office/word/2010/wordprocessingCanvas" xmlns:cx="http://schemas.microsoft.com/office/drawing/2014/chartex" xmlns:cx1="http://schemas.microsoft.com/office/drawing/2015/9/8/chartex" xmlns:cx2="http://schemas.microsoft.com/office/drawing/2015/10/21/chartex" xmlns:cx3="http://schemas.microsoft.com/office/drawing/2016/5/9/chartex" xmlns:cx4="http://schemas.microsoft.com/office/drawing/2016/5/10/chartex" xmlns:cx5="http://schemas.microsoft.com/office/drawing/2016/5/11/chartex" xmlns:cx6="http://schemas.microsoft.com/office/drawing/2016/5/12/chartex" xmlns:cx7="http://schemas.microsoft.com/office/drawing/2016/5/13/chartex" xmlns:cx8="http://schemas.microsoft.com/office/drawing/2016/5/14/chartex" xmlns:mc="http://schemas.openxmlformats.org/markup-compatibility/2006" xmlns:aink="http://schemas.microsoft.com/office/drawing/2016/ink" xmlns:am3d="http://schemas.microsoft.com/office/drawing/2017/model3d" xmlns:o="urn:schemas-microsoft-com:office:office" xmlns:oel="http://schemas.microsoft.com/office/2019/extlst" xmlns:r="http://schemas.openxmlformats.org/officeDocument/2006/relationships" xmlns:m="http://schemas.openxmlformats.org/officeDocument/2006/math" xmlns:v="urn:schemas-microsoft-com:vml" xmlns:wp14="http://schemas.microsoft.com/office/word/2010/wordprocessingDrawing" xmlns:wp="http://schemas.openxmlformats.org/drawingml/2006/wordprocessingDrawing" xmlns:w10="urn:schemas-microsoft-com:office:word" xmlns:w="http://schemas.openxmlformats.org/wordprocessingml/2006/main" xmlns:w14="http://schemas.microsoft.com/office/word/2010/wordml" xmlns:w15="http://schemas.microsoft.com/office/word/2012/wordml" xmlns:w16cei="http://schemas.microsoft.com/office/word/2026/wordml/cei" xmlns:w16cex="http://schemas.microsoft.com/office/word/2018/wordml/cex" xmlns:w16cid="http://schemas.microsoft.com/office/word/2016/wordml/cid" xmlns:w16="http://schemas.microsoft.com/office/word/2018/wordml" xmlns:w16du="http://schemas.microsoft.com/office/word/2023/wordml/word16du" xmlns:w16sdtdh="http://schemas.microsoft.com/office/word/2020/wordml/sdtdatahash" xmlns:w16sdtfl="http://schemas.microsoft.com/office/word/2024/wordml/sdtformatlock" xmlns:w16se="http://schemas.microsoft.com/office/word/2015/wordml/symex" xmlns:wpg="http://schemas.microsoft.com/office/word/2010/wordprocessingGroup" xmlns:wpi="http://schemas.microsoft.com/office/word/2010/wordprocessingInk" xmlns:wne="http://schemas.microsoft.com/office/word/2006/wordml" xmlns:wps="http://schemas.microsoft.com/office/word/2010/wordprocessingShape" mc:Ignorable="w14 w15 w16se w16cid w16 w16cex w16sdtdh w16sdtfl w16du wp14">
+<w:footnotes xmlns:wpc="http://schemas.microsoft.com/office/word/2010/wordprocessingCanvas" xmlns:cx="http://schemas.microsoft.com/office/drawing/2014/chartex" xmlns:cx1="http://schemas.microsoft.com/office/drawing/2015/9/8/chartex" xmlns:cx2="http://schemas.microsoft.com/office/drawing/2015/10/21/chartex" xmlns:cx3="http://schemas.microsoft.com/office/drawing/2016/5/9/chartex" xmlns:cx4="http://schemas.microsoft.com/office/drawing/2016/5/10/chartex" xmlns:cx5="http://schemas.microsoft.com/office/drawing/2016/5/11/chartex" xmlns:cx6="http://schemas.microsoft.com/office/drawing/2016/5/12/chartex" xmlns:cx7="http://schemas.microsoft.com/office/drawing/2016/5/13/chartex" xmlns:cx8="http://schemas.microsoft.com/office/drawing/2016/5/14/chartex" xmlns:mc="http://schemas.openxmlformats.org/markup-compatibility/2006" xmlns:aink="http://schemas.microsoft.com/office/drawing/2016/ink" xmlns:am3d="http://schemas.microsoft.com/office/drawing/2017/model3d" xmlns:o="urn:schemas-microsoft-com:office:office" xmlns:oel="http://schemas.microsoft.com/office/2019/extlst" xmlns:r="http://schemas.openxmlformats.org/officeDocument/2006/relationships" xmlns:m="http://schemas.openxmlformats.org/officeDocument/2006/math" xmlns:v="urn:schemas-microsoft-com:vml" xmlns:wp14="http://schemas.microsoft.com/office/word/2010/wordprocessingDrawing" xmlns:wp="http://schemas.openxmlformats.org/drawingml/2006/wordprocessingDrawing" xmlns:w10="urn:schemas-microsoft-com:office:word" xmlns:w="http://schemas.openxmlformats.org/wordprocessingml/2006/main" xmlns:w14="http://schemas.microsoft.com/office/word/2010/wordml" xmlns:w15="http://schemas.microsoft.com/office/word/2012/wordml" xmlns:w16cex="http://schemas.microsoft.com/office/word/2018/wordml/cex" xmlns:w16cid="http://schemas.microsoft.com/office/word/2016/wordml/cid" xmlns:w16="http://schemas.microsoft.com/office/word/2018/wordml" xmlns:w16du="http://schemas.microsoft.com/office/word/2023/wordml/word16du" xmlns:w16sdtdh="http://schemas.microsoft.com/office/word/2020/wordml/sdtdatahash" xmlns:w16sdtfl="http://schemas.microsoft.com/office/word/2024/wordml/sdtformatlock" xmlns:w16se="http://schemas.microsoft.com/office/word/2015/wordml/symex" xmlns:wpg="http://schemas.microsoft.com/office/word/2010/wordprocessingGroup" xmlns:wpi="http://schemas.microsoft.com/office/word/2010/wordprocessingInk" xmlns:wne="http://schemas.microsoft.com/office/word/2006/wordml" xmlns:wps="http://schemas.microsoft.com/office/word/2010/wordprocessingShape" mc:Ignorable="w14 w15 w16se w16cid w16 w16cex w16sdtdh w16sdtfl w16du wp14">
   <w:footnote w:type="separator" w:id="-1">
     <w:p>
       <w:pPr>
@@ -34195,7 +34140,7 @@
 </file>
 
 <file path=word/header1.xml><?xml version="1.0" encoding="utf-8"?>
-<w:hdr xmlns:wpc="http://schemas.microsoft.com/office/word/2010/wordprocessingCanvas" xmlns:cx="http://schemas.microsoft.com/office/drawing/2014/chartex" xmlns:cx1="http://schemas.microsoft.com/office/drawing/2015/9/8/chartex" xmlns:cx2="http://schemas.microsoft.com/office/drawing/2015/10/21/chartex" xmlns:cx3="http://schemas.microsoft.com/office/drawing/2016/5/9/chartex" xmlns:cx4="http://schemas.microsoft.com/office/drawing/2016/5/10/chartex" xmlns:cx5="http://schemas.microsoft.com/office/drawing/2016/5/11/chartex" xmlns:cx6="http://schemas.microsoft.com/office/drawing/2016/5/12/chartex" xmlns:cx7="http://schemas.microsoft.com/office/drawing/2016/5/13/chartex" xmlns:cx8="http://schemas.microsoft.com/office/drawing/2016/5/14/chartex" xmlns:mc="http://schemas.openxmlformats.org/markup-compatibility/2006" xmlns:aink="http://schemas.microsoft.com/office/drawing/2016/ink" xmlns:am3d="http://schemas.microsoft.com/office/drawing/2017/model3d" xmlns:o="urn:schemas-microsoft-com:office:office" xmlns:oel="http://schemas.microsoft.com/office/2019/extlst" xmlns:r="http://schemas.openxmlformats.org/officeDocument/2006/relationships" xmlns:m="http://schemas.openxmlformats.org/officeDocument/2006/math" xmlns:v="urn:schemas-microsoft-com:vml" xmlns:wp14="http://schemas.microsoft.com/office/word/2010/wordprocessingDrawing" xmlns:wp="http://schemas.openxmlformats.org/drawingml/2006/wordprocessingDrawing" xmlns:w10="urn:schemas-microsoft-com:office:word" xmlns:w="http://schemas.openxmlformats.org/wordprocessingml/2006/main" xmlns:w14="http://schemas.microsoft.com/office/word/2010/wordml" xmlns:w15="http://schemas.microsoft.com/office/word/2012/wordml" xmlns:w16cei="http://schemas.microsoft.com/office/word/2026/wordml/cei" xmlns:w16cex="http://schemas.microsoft.com/office/word/2018/wordml/cex" xmlns:w16cid="http://schemas.microsoft.com/office/word/2016/wordml/cid" xmlns:w16="http://schemas.microsoft.com/office/word/2018/wordml" xmlns:w16du="http://schemas.microsoft.com/office/word/2023/wordml/word16du" xmlns:w16sdtdh="http://schemas.microsoft.com/office/word/2020/wordml/sdtdatahash" xmlns:w16sdtfl="http://schemas.microsoft.com/office/word/2024/wordml/sdtformatlock" xmlns:w16se="http://schemas.microsoft.com/office/word/2015/wordml/symex" xmlns:wpg="http://schemas.microsoft.com/office/word/2010/wordprocessingGroup" xmlns:wpi="http://schemas.microsoft.com/office/word/2010/wordprocessingInk" xmlns:wne="http://schemas.microsoft.com/office/word/2006/wordml" xmlns:wps="http://schemas.microsoft.com/office/word/2010/wordprocessingShape" mc:Ignorable="w14 w15 w16se w16cid w16 w16cex w16sdtdh w16sdtfl w16du wp14">
+<w:hdr xmlns:wpc="http://schemas.microsoft.com/office/word/2010/wordprocessingCanvas" xmlns:cx="http://schemas.microsoft.com/office/drawing/2014/chartex" xmlns:cx1="http://schemas.microsoft.com/office/drawing/2015/9/8/chartex" xmlns:cx2="http://schemas.microsoft.com/office/drawing/2015/10/21/chartex" xmlns:cx3="http://schemas.microsoft.com/office/drawing/2016/5/9/chartex" xmlns:cx4="http://schemas.microsoft.com/office/drawing/2016/5/10/chartex" xmlns:cx5="http://schemas.microsoft.com/office/drawing/2016/5/11/chartex" xmlns:cx6="http://schemas.microsoft.com/office/drawing/2016/5/12/chartex" xmlns:cx7="http://schemas.microsoft.com/office/drawing/2016/5/13/chartex" xmlns:cx8="http://schemas.microsoft.com/office/drawing/2016/5/14/chartex" xmlns:mc="http://schemas.openxmlformats.org/markup-compatibility/2006" xmlns:aink="http://schemas.microsoft.com/office/drawing/2016/ink" xmlns:am3d="http://schemas.microsoft.com/office/drawing/2017/model3d" xmlns:o="urn:schemas-microsoft-com:office:office" xmlns:oel="http://schemas.microsoft.com/office/2019/extlst" xmlns:r="http://schemas.openxmlformats.org/officeDocument/2006/relationships" xmlns:m="http://schemas.openxmlformats.org/officeDocument/2006/math" xmlns:v="urn:schemas-microsoft-com:vml" xmlns:wp14="http://schemas.microsoft.com/office/word/2010/wordprocessingDrawing" xmlns:wp="http://schemas.openxmlformats.org/drawingml/2006/wordprocessingDrawing" xmlns:w10="urn:schemas-microsoft-com:office:word" xmlns:w="http://schemas.openxmlformats.org/wordprocessingml/2006/main" xmlns:w14="http://schemas.microsoft.com/office/word/2010/wordml" xmlns:w15="http://schemas.microsoft.com/office/word/2012/wordml" xmlns:w16cex="http://schemas.microsoft.com/office/word/2018/wordml/cex" xmlns:w16cid="http://schemas.microsoft.com/office/word/2016/wordml/cid" xmlns:w16="http://schemas.microsoft.com/office/word/2018/wordml" xmlns:w16du="http://schemas.microsoft.com/office/word/2023/wordml/word16du" xmlns:w16sdtdh="http://schemas.microsoft.com/office/word/2020/wordml/sdtdatahash" xmlns:w16sdtfl="http://schemas.microsoft.com/office/word/2024/wordml/sdtformatlock" xmlns:w16se="http://schemas.microsoft.com/office/word/2015/wordml/symex" xmlns:wpg="http://schemas.microsoft.com/office/word/2010/wordprocessingGroup" xmlns:wpi="http://schemas.microsoft.com/office/word/2010/wordprocessingInk" xmlns:wne="http://schemas.microsoft.com/office/word/2006/wordml" xmlns:wps="http://schemas.microsoft.com/office/word/2010/wordprocessingShape" mc:Ignorable="w14 w15 w16se w16cid w16 w16cex w16sdtdh w16sdtfl w16du wp14">
   <w:p>
     <w:pPr>
       <w:pStyle w:val="Header"/>
@@ -34253,7 +34198,7 @@
 </file>
 
 <file path=word/numbering.xml><?xml version="1.0" encoding="utf-8"?>
-<w:numbering xmlns:wpc="http://schemas.microsoft.com/office/word/2010/wordprocessingCanvas" xmlns:cx="http://schemas.microsoft.com/office/drawing/2014/chartex" xmlns:cx1="http://schemas.microsoft.com/office/drawing/2015/9/8/chartex" xmlns:cx2="http://schemas.microsoft.com/office/drawing/2015/10/21/chartex" xmlns:cx3="http://schemas.microsoft.com/office/drawing/2016/5/9/chartex" xmlns:cx4="http://schemas.microsoft.com/office/drawing/2016/5/10/chartex" xmlns:cx5="http://schemas.microsoft.com/office/drawing/2016/5/11/chartex" xmlns:cx6="http://schemas.microsoft.com/office/drawing/2016/5/12/chartex" xmlns:cx7="http://schemas.microsoft.com/office/drawing/2016/5/13/chartex" xmlns:cx8="http://schemas.microsoft.com/office/drawing/2016/5/14/chartex" xmlns:mc="http://schemas.openxmlformats.org/markup-compatibility/2006" xmlns:aink="http://schemas.microsoft.com/office/drawing/2016/ink" xmlns:am3d="http://schemas.microsoft.com/office/drawing/2017/model3d" xmlns:o="urn:schemas-microsoft-com:office:office" xmlns:oel="http://schemas.microsoft.com/office/2019/extlst" xmlns:r="http://schemas.openxmlformats.org/officeDocument/2006/relationships" xmlns:m="http://schemas.openxmlformats.org/officeDocument/2006/math" xmlns:v="urn:schemas-microsoft-com:vml" xmlns:wp14="http://schemas.microsoft.com/office/word/2010/wordprocessingDrawing" xmlns:wp="http://schemas.openxmlformats.org/drawingml/2006/wordprocessingDrawing" xmlns:w10="urn:schemas-microsoft-com:office:word" xmlns:w="http://schemas.openxmlformats.org/wordprocessingml/2006/main" xmlns:w14="http://schemas.microsoft.com/office/word/2010/wordml" xmlns:w15="http://schemas.microsoft.com/office/word/2012/wordml" xmlns:w16cei="http://schemas.microsoft.com/office/word/2026/wordml/cei" xmlns:w16cex="http://schemas.microsoft.com/office/word/2018/wordml/cex" xmlns:w16cid="http://schemas.microsoft.com/office/word/2016/wordml/cid" xmlns:w16="http://schemas.microsoft.com/office/word/2018/wordml" xmlns:w16du="http://schemas.microsoft.com/office/word/2023/wordml/word16du" xmlns:w16sdtdh="http://schemas.microsoft.com/office/word/2020/wordml/sdtdatahash" xmlns:w16sdtfl="http://schemas.microsoft.com/office/word/2024/wordml/sdtformatlock" xmlns:w16se="http://schemas.microsoft.com/office/word/2015/wordml/symex" xmlns:wpg="http://schemas.microsoft.com/office/word/2010/wordprocessingGroup" xmlns:wpi="http://schemas.microsoft.com/office/word/2010/wordprocessingInk" xmlns:wne="http://schemas.microsoft.com/office/word/2006/wordml" xmlns:wps="http://schemas.microsoft.com/office/word/2010/wordprocessingShape" mc:Ignorable="w14 w15 w16se w16cid w16 w16cex w16sdtdh w16sdtfl w16du wp14">
+<w:numbering xmlns:wpc="http://schemas.microsoft.com/office/word/2010/wordprocessingCanvas" xmlns:cx="http://schemas.microsoft.com/office/drawing/2014/chartex" xmlns:cx1="http://schemas.microsoft.com/office/drawing/2015/9/8/chartex" xmlns:cx2="http://schemas.microsoft.com/office/drawing/2015/10/21/chartex" xmlns:cx3="http://schemas.microsoft.com/office/drawing/2016/5/9/chartex" xmlns:cx4="http://schemas.microsoft.com/office/drawing/2016/5/10/chartex" xmlns:cx5="http://schemas.microsoft.com/office/drawing/2016/5/11/chartex" xmlns:cx6="http://schemas.microsoft.com/office/drawing/2016/5/12/chartex" xmlns:cx7="http://schemas.microsoft.com/office/drawing/2016/5/13/chartex" xmlns:cx8="http://schemas.microsoft.com/office/drawing/2016/5/14/chartex" xmlns:mc="http://schemas.openxmlformats.org/markup-compatibility/2006" xmlns:aink="http://schemas.microsoft.com/office/drawing/2016/ink" xmlns:am3d="http://schemas.microsoft.com/office/drawing/2017/model3d" xmlns:o="urn:schemas-microsoft-com:office:office" xmlns:oel="http://schemas.microsoft.com/office/2019/extlst" xmlns:r="http://schemas.openxmlformats.org/officeDocument/2006/relationships" xmlns:m="http://schemas.openxmlformats.org/officeDocument/2006/math" xmlns:v="urn:schemas-microsoft-com:vml" xmlns:wp14="http://schemas.microsoft.com/office/word/2010/wordprocessingDrawing" xmlns:wp="http://schemas.openxmlformats.org/drawingml/2006/wordprocessingDrawing" xmlns:w10="urn:schemas-microsoft-com:office:word" xmlns:w="http://schemas.openxmlformats.org/wordprocessingml/2006/main" xmlns:w14="http://schemas.microsoft.com/office/word/2010/wordml" xmlns:w15="http://schemas.microsoft.com/office/word/2012/wordml" xmlns:w16cex="http://schemas.microsoft.com/office/word/2018/wordml/cex" xmlns:w16cid="http://schemas.microsoft.com/office/word/2016/wordml/cid" xmlns:w16="http://schemas.microsoft.com/office/word/2018/wordml" xmlns:w16du="http://schemas.microsoft.com/office/word/2023/wordml/word16du" xmlns:w16sdtdh="http://schemas.microsoft.com/office/word/2020/wordml/sdtdatahash" xmlns:w16sdtfl="http://schemas.microsoft.com/office/word/2024/wordml/sdtformatlock" xmlns:w16se="http://schemas.microsoft.com/office/word/2015/wordml/symex" xmlns:wpg="http://schemas.microsoft.com/office/word/2010/wordprocessingGroup" xmlns:wpi="http://schemas.microsoft.com/office/word/2010/wordprocessingInk" xmlns:wne="http://schemas.microsoft.com/office/word/2006/wordml" xmlns:wps="http://schemas.microsoft.com/office/word/2010/wordprocessingShape" mc:Ignorable="w14 w15 w16se w16cid w16 w16cex w16sdtdh w16sdtfl w16du wp14">
   <w:abstractNum w:abstractNumId="0" w15:restartNumberingAfterBreak="0">
     <w:nsid w:val="025D497D"/>
     <w:multiLevelType w:val="multilevel"/>

</xml_diff>